<commit_message>
Docs: requirements v2 updated with Rista menu export and cancelled transactions
Co-Authored-By: Claude Opus 5.5 <noreply@anthropic.com>
</commit_message>
<xml_diff>
--- a/docs/Skope-Next-Phase-Questions-v2.docx
+++ b/docs/Skope-Next-Phase-Questions-v2.docx
@@ -1837,7 +1837,7 @@
         <w:spacing w:after="120" w:line="276"/>
       </w:pPr>
       <w:r>
-        <w:t xml:space="preserve">On 19 October we went through the Rista portal with Keshava and downloaded one month of sales ("Sales Items By Transaction", 19 September to 19 October 2026). The numbers below come from that file. Customer names and phone numbers in it were not copied anywhere.</w:t>
+        <w:t xml:space="preserve">On 19 October we went through the Rista portal with Keshava and downloaded one month of sales ("Sales Items By Transaction", 19 September to 19 October 2026). On 20 October we also downloaded the full menu ("Export Items") and one month of cancelled orders ("Cancelled Transactions"). The numbers below come from those three files. Customer names and phone numbers in them were not copied anywhere.</w:t>
       </w:r>
     </w:p>
     <w:tbl>
@@ -2194,7 +2194,7 @@
                 <w:sz w:val="20"/>
                 <w:szCs w:val="20"/>
               </w:rPr>
-              <w:t xml:space="preserve">Rista has 5 branches. All sales came from 2 of them: JP Nagar and Marathahalli, both marked "Outlet".</w:t>
+              <w:t xml:space="preserve">Rista has 5 branches. All sales came from 2 of them: JP Nagar and Marathahalli, both marked "Outlet". The menu also has prices for Jayanagar, Kalyan Nagar and Koramangala, which look like the other 3.</w:t>
             </w:r>
           </w:p>
         </w:tc>
@@ -2396,7 +2396,7 @@
                 <w:sz w:val="20"/>
                 <w:szCs w:val="20"/>
               </w:rPr>
-              <w:t xml:space="preserve">Each line has a "Business Brand" and an "Account Name", and they do not always match. For example, some Kochi Kurry Klub sales carry the account names Al Mashawi Shawarma, Chicbun, Corporate Menu or ODC Event.</w:t>
+              <w:t xml:space="preserve">Each line has a "Business Brand" and an "Account Name", and they do not always match. For example, some Kochi Kurry Klub sales carry the account names Al Mashawi Shawarma, Chicbun, Corporate Menu or ODC Event. The Account Name is always the brand that owns the dish in the menu (all 11,498 matched lines agree), so the Business Brand seems to be the brand the customer ordered from.</w:t>
             </w:r>
           </w:p>
         </w:tc>
@@ -2501,7 +2501,7 @@
                 <w:sz w:val="20"/>
                 <w:szCs w:val="20"/>
               </w:rPr>
-              <w:t xml:space="preserve">Business day</w:t>
+              <w:t xml:space="preserve">Menu (export)</w:t>
             </w:r>
           </w:p>
         </w:tc>
@@ -2531,7 +2531,7 @@
                 <w:sz w:val="20"/>
                 <w:szCs w:val="20"/>
               </w:rPr>
-              <w:t xml:space="preserve">Every sale already has a Rista "Business Date", separate from the exact invoice time.</w:t>
+              <w:t xml:space="preserve">1,507 dishes (1,465 active) in 144 categories under 25 brand accounts, 196 of them with sizes. Only 340 active dishes sold in the month. 8 brands have a menu but no sales: Punjabi House, Bao Bangalore, Kritunga, Chaat-GPT, Saladeo, The Big Biryani Theory, Pynch and Swanky Spoon Society.</w:t>
             </w:r>
           </w:p>
         </w:tc>
@@ -2568,7 +2568,7 @@
                 <w:sz w:val="20"/>
                 <w:szCs w:val="20"/>
               </w:rPr>
-              <w:t xml:space="preserve">Costs in Rista</w:t>
+              <w:t xml:space="preserve">Prices</w:t>
             </w:r>
           </w:p>
         </w:tc>
@@ -2599,7 +2599,7 @@
                 <w:sz w:val="20"/>
                 <w:szCs w:val="20"/>
               </w:rPr>
-              <w:t xml:space="preserve">Rista records a materials cost on some lines (3,629 of 13,829), so Rista's own inventory may be in use.</w:t>
+              <w:t xml:space="preserve">Each dish can have a different price for each branch and channel (224 price columns, for example "JP Nagar: Swiggy(Kochi Kurry Klub)"), and can be switched off per channel.</w:t>
             </w:r>
           </w:p>
         </w:tc>
@@ -2636,7 +2636,7 @@
                 <w:sz w:val="20"/>
                 <w:szCs w:val="20"/>
               </w:rPr>
-              <w:t xml:space="preserve">Customer details</w:t>
+              <w:t xml:space="preserve">Matching sales to the menu</w:t>
             </w:r>
           </w:p>
         </w:tc>
@@ -2666,7 +2666,7 @@
                 <w:sz w:val="20"/>
                 <w:szCs w:val="20"/>
               </w:rPr>
-              <w:t xml:space="preserve">A name and phone number appear on 787 lines (6%).</w:t>
+              <w:t xml:space="preserve">Every dish sold matches the menu by its code, except 2 codes (114 and GIA013, 25 lines). Options and add-ons are not in this export; they are in Rista's separate Add-Ons list.</w:t>
             </w:r>
           </w:p>
         </w:tc>
@@ -2703,7 +2703,7 @@
                 <w:sz w:val="20"/>
                 <w:szCs w:val="20"/>
               </w:rPr>
-              <w:t xml:space="preserve">Cancelled orders</w:t>
+              <w:t xml:space="preserve">Business day</w:t>
             </w:r>
           </w:p>
         </w:tc>
@@ -2734,7 +2734,7 @@
                 <w:sz w:val="20"/>
                 <w:szCs w:val="20"/>
               </w:rPr>
-              <w:t xml:space="preserve">This file has none: every line is a completed sale. Rista keeps cancellations in a separate "Cancelled Transactions" report.</w:t>
+              <w:t xml:space="preserve">Every sale already has a Rista "Business Date", separate from the exact invoice time.</w:t>
             </w:r>
           </w:p>
         </w:tc>
@@ -2771,7 +2771,7 @@
                 <w:sz w:val="20"/>
                 <w:szCs w:val="20"/>
               </w:rPr>
-              <w:t xml:space="preserve">Report limits</w:t>
+              <w:t xml:space="preserve">Costs in Rista</w:t>
             </w:r>
           </w:p>
         </w:tc>
@@ -2801,7 +2801,7 @@
                 <w:sz w:val="20"/>
                 <w:szCs w:val="20"/>
               </w:rPr>
-              <w:t xml:space="preserve">Rista shows a sales report on screen for at most 7 days and 1 branch. Bigger ones are emailed or downloaded, and downloads are kept for only 3 days.</w:t>
+              <w:t xml:space="preserve">Rista records a materials cost on some lines (3,629 of 13,829), so Rista's own inventory may be in use.</w:t>
             </w:r>
           </w:p>
         </w:tc>
@@ -2838,7 +2838,7 @@
                 <w:sz w:val="20"/>
                 <w:szCs w:val="20"/>
               </w:rPr>
-              <w:t xml:space="preserve">Menu (catalog)</w:t>
+              <w:t xml:space="preserve">Customer details</w:t>
             </w:r>
           </w:p>
         </w:tc>
@@ -2869,7 +2869,7 @@
                 <w:sz w:val="20"/>
                 <w:szCs w:val="20"/>
               </w:rPr>
-              <w:t xml:space="preserve">Dishes have a photo, veg or non-veg tag, code and price, and can be marked unavailable. Rista has bulk "Upload Items", "Upload Item Price", "Bulk Image Update" and "Export Items", a "Price book" for channel prices, a "Display Book" per channel and branch, item options and item schedules.</w:t>
+              <w:t xml:space="preserve">A name and phone number appear on 787 lines (6%).</w:t>
             </w:r>
           </w:p>
         </w:tc>
@@ -2906,7 +2906,7 @@
                 <w:sz w:val="20"/>
                 <w:szCs w:val="20"/>
               </w:rPr>
-              <w:t xml:space="preserve">Live order board</w:t>
+              <w:t xml:space="preserve">Cancelled orders</w:t>
             </w:r>
           </w:p>
         </w:tc>
@@ -2936,7 +2936,7 @@
                 <w:sz w:val="20"/>
                 <w:szCs w:val="20"/>
               </w:rPr>
-              <w:t xml:space="preserve">Online orders move through New, Accepted / Preparing, Prepared, Processed, Dispatched, Delivered and Cancelled, with advance orders and separate online and offline tabs.</w:t>
+              <w:t xml:space="preserve">77 in the month (about 1 in 85 orders, ₹27,830), none of them in the sales file. 69 were cancelled automatically by Zomato, Swiggy or Ownly (customer cancelled, no delivery partner, out of stock); 8 were cancelled by staff, mostly "Wrongly Punched". The report says how far the order got before it was cancelled.</w:t>
             </w:r>
           </w:p>
         </w:tc>
@@ -2973,7 +2973,7 @@
                 <w:sz w:val="20"/>
                 <w:szCs w:val="20"/>
               </w:rPr>
-              <w:t xml:space="preserve">Dine-in</w:t>
+              <w:t xml:space="preserve">Report limits</w:t>
             </w:r>
           </w:p>
         </w:tc>
@@ -3004,7 +3004,7 @@
                 <w:sz w:val="20"/>
                 <w:szCs w:val="20"/>
               </w:rPr>
-              <w:t xml:space="preserve">There is a table view (20 tables) and a point-of-sale screen for dine-in orders.</w:t>
+              <w:t xml:space="preserve">On screen, reports show at most 7 days (1 to 8 branches, depending on the report). Downloads are not limited: one download covered a whole month and all branches. Some exports, like the menu, are emailed to datamanagement@skopekitchens.com instead of downloaded.</w:t>
             </w:r>
           </w:p>
         </w:tc>
@@ -3041,6 +3041,208 @@
                 <w:sz w:val="20"/>
                 <w:szCs w:val="20"/>
               </w:rPr>
+              <w:t xml:space="preserve">Menu (catalog)</w:t>
+            </w:r>
+          </w:p>
+        </w:tc>
+        <w:tc>
+          <w:tcPr>
+            <w:tcW w:type="dxa" w:w="7446"/>
+            <w:tcBorders>
+              <w:top w:val="single" w:color="BFBFBF" w:sz="4"/>
+              <w:left w:val="single" w:color="BFBFBF" w:sz="4"/>
+              <w:bottom w:val="single" w:color="BFBFBF" w:sz="4"/>
+              <w:right w:val="single" w:color="BFBFBF" w:sz="4"/>
+            </w:tcBorders>
+            <w:tcMar>
+              <w:top w:type="dxa" w:w="70"/>
+              <w:left w:type="dxa" w:w="110"/>
+              <w:bottom w:type="dxa" w:w="70"/>
+              <w:right w:type="dxa" w:w="110"/>
+            </w:tcMar>
+            <w:vAlign w:val="top"/>
+          </w:tcPr>
+          <w:p>
+            <w:pPr>
+              <w:spacing w:after="40" w:line="252"/>
+            </w:pPr>
+            <w:r>
+              <w:rPr>
+                <w:sz w:val="20"/>
+                <w:szCs w:val="20"/>
+              </w:rPr>
+              <w:t xml:space="preserve">Dishes have a photo, veg or non-veg tag, code and price, and can be marked unavailable. Rista has bulk "Upload Items", "Upload Item Price", "Bulk Image Update" and "Export Items", a "Price book" for channel prices, a "Display Book" per channel and branch, item options and item schedules.</w:t>
+            </w:r>
+          </w:p>
+        </w:tc>
+      </w:tr>
+      <w:tr>
+        <w:trPr>
+          <w:cantSplit/>
+        </w:trPr>
+        <w:tc>
+          <w:tcPr>
+            <w:tcW w:type="dxa" w:w="2300"/>
+            <w:tcBorders>
+              <w:top w:val="single" w:color="BFBFBF" w:sz="4"/>
+              <w:left w:val="single" w:color="BFBFBF" w:sz="4"/>
+              <w:bottom w:val="single" w:color="BFBFBF" w:sz="4"/>
+              <w:right w:val="single" w:color="BFBFBF" w:sz="4"/>
+            </w:tcBorders>
+            <w:tcMar>
+              <w:top w:type="dxa" w:w="70"/>
+              <w:left w:type="dxa" w:w="110"/>
+              <w:bottom w:type="dxa" w:w="70"/>
+              <w:right w:type="dxa" w:w="110"/>
+            </w:tcMar>
+            <w:vAlign w:val="top"/>
+          </w:tcPr>
+          <w:p>
+            <w:pPr>
+              <w:spacing w:after="40" w:line="252"/>
+            </w:pPr>
+            <w:r>
+              <w:rPr>
+                <w:b/>
+                <w:bCs/>
+                <w:sz w:val="20"/>
+                <w:szCs w:val="20"/>
+              </w:rPr>
+              <w:t xml:space="preserve">Live order board</w:t>
+            </w:r>
+          </w:p>
+        </w:tc>
+        <w:tc>
+          <w:tcPr>
+            <w:tcW w:type="dxa" w:w="7446"/>
+            <w:tcBorders>
+              <w:top w:val="single" w:color="BFBFBF" w:sz="4"/>
+              <w:left w:val="single" w:color="BFBFBF" w:sz="4"/>
+              <w:bottom w:val="single" w:color="BFBFBF" w:sz="4"/>
+              <w:right w:val="single" w:color="BFBFBF" w:sz="4"/>
+            </w:tcBorders>
+            <w:shd w:fill="F5F7FB" w:color="auto" w:val="clear"/>
+            <w:tcMar>
+              <w:top w:type="dxa" w:w="70"/>
+              <w:left w:type="dxa" w:w="110"/>
+              <w:bottom w:type="dxa" w:w="70"/>
+              <w:right w:type="dxa" w:w="110"/>
+            </w:tcMar>
+            <w:vAlign w:val="top"/>
+          </w:tcPr>
+          <w:p>
+            <w:pPr>
+              <w:spacing w:after="40" w:line="252"/>
+            </w:pPr>
+            <w:r>
+              <w:rPr>
+                <w:sz w:val="20"/>
+                <w:szCs w:val="20"/>
+              </w:rPr>
+              <w:t xml:space="preserve">Online orders move through New, Accepted / Preparing, Prepared, Processed, Dispatched, Delivered and Cancelled, with advance orders and separate online and offline tabs.</w:t>
+            </w:r>
+          </w:p>
+        </w:tc>
+      </w:tr>
+      <w:tr>
+        <w:trPr>
+          <w:cantSplit/>
+        </w:trPr>
+        <w:tc>
+          <w:tcPr>
+            <w:tcW w:type="dxa" w:w="2300"/>
+            <w:tcBorders>
+              <w:top w:val="single" w:color="BFBFBF" w:sz="4"/>
+              <w:left w:val="single" w:color="BFBFBF" w:sz="4"/>
+              <w:bottom w:val="single" w:color="BFBFBF" w:sz="4"/>
+              <w:right w:val="single" w:color="BFBFBF" w:sz="4"/>
+            </w:tcBorders>
+            <w:tcMar>
+              <w:top w:type="dxa" w:w="70"/>
+              <w:left w:type="dxa" w:w="110"/>
+              <w:bottom w:type="dxa" w:w="70"/>
+              <w:right w:type="dxa" w:w="110"/>
+            </w:tcMar>
+            <w:vAlign w:val="top"/>
+          </w:tcPr>
+          <w:p>
+            <w:pPr>
+              <w:spacing w:after="40" w:line="252"/>
+            </w:pPr>
+            <w:r>
+              <w:rPr>
+                <w:b/>
+                <w:bCs/>
+                <w:sz w:val="20"/>
+                <w:szCs w:val="20"/>
+              </w:rPr>
+              <w:t xml:space="preserve">Dine-in</w:t>
+            </w:r>
+          </w:p>
+        </w:tc>
+        <w:tc>
+          <w:tcPr>
+            <w:tcW w:type="dxa" w:w="7446"/>
+            <w:tcBorders>
+              <w:top w:val="single" w:color="BFBFBF" w:sz="4"/>
+              <w:left w:val="single" w:color="BFBFBF" w:sz="4"/>
+              <w:bottom w:val="single" w:color="BFBFBF" w:sz="4"/>
+              <w:right w:val="single" w:color="BFBFBF" w:sz="4"/>
+            </w:tcBorders>
+            <w:tcMar>
+              <w:top w:type="dxa" w:w="70"/>
+              <w:left w:type="dxa" w:w="110"/>
+              <w:bottom w:type="dxa" w:w="70"/>
+              <w:right w:type="dxa" w:w="110"/>
+            </w:tcMar>
+            <w:vAlign w:val="top"/>
+          </w:tcPr>
+          <w:p>
+            <w:pPr>
+              <w:spacing w:after="40" w:line="252"/>
+            </w:pPr>
+            <w:r>
+              <w:rPr>
+                <w:sz w:val="20"/>
+                <w:szCs w:val="20"/>
+              </w:rPr>
+              <w:t xml:space="preserve">There is a table view (20 tables) and a point-of-sale screen for dine-in orders.</w:t>
+            </w:r>
+          </w:p>
+        </w:tc>
+      </w:tr>
+      <w:tr>
+        <w:trPr>
+          <w:cantSplit/>
+        </w:trPr>
+        <w:tc>
+          <w:tcPr>
+            <w:tcW w:type="dxa" w:w="2300"/>
+            <w:tcBorders>
+              <w:top w:val="single" w:color="BFBFBF" w:sz="4"/>
+              <w:left w:val="single" w:color="BFBFBF" w:sz="4"/>
+              <w:bottom w:val="single" w:color="BFBFBF" w:sz="4"/>
+              <w:right w:val="single" w:color="BFBFBF" w:sz="4"/>
+            </w:tcBorders>
+            <w:tcMar>
+              <w:top w:type="dxa" w:w="70"/>
+              <w:left w:type="dxa" w:w="110"/>
+              <w:bottom w:type="dxa" w:w="70"/>
+              <w:right w:type="dxa" w:w="110"/>
+            </w:tcMar>
+            <w:vAlign w:val="top"/>
+          </w:tcPr>
+          <w:p>
+            <w:pPr>
+              <w:spacing w:after="40" w:line="252"/>
+            </w:pPr>
+            <w:r>
+              <w:rPr>
+                <w:b/>
+                <w:bCs/>
+                <w:sz w:val="20"/>
+                <w:szCs w:val="20"/>
+              </w:rPr>
               <w:t xml:space="preserve">People in Rista</w:t>
             </w:r>
           </w:p>
@@ -3054,6 +3256,7 @@
               <w:bottom w:val="single" w:color="BFBFBF" w:sz="4"/>
               <w:right w:val="single" w:color="BFBFBF" w:sz="4"/>
             </w:tcBorders>
+            <w:shd w:fill="F5F7FB" w:color="auto" w:val="clear"/>
             <w:tcMar>
               <w:top w:type="dxa" w:w="70"/>
               <w:left w:type="dxa" w:w="110"/>
@@ -3139,7 +3342,7 @@
         <w:spacing w:after="60"/>
       </w:pPr>
       <w:r>
-        <w:t xml:space="preserve">Importing sales automatically must work around Rista's limits: one branch and one day at a time, overnight.</w:t>
+        <w:t xml:space="preserve">Until the API is ready, reports can start from one monthly Rista download covering all branches.</w:t>
       </w:r>
     </w:p>
     <w:p>
@@ -3152,7 +3355,33 @@
         <w:spacing w:after="60"/>
       </w:pPr>
       <w:r>
-        <w:t xml:space="preserve">Rista already supports channel prices and bulk Excel uploads, so menu changes have a fallback even if the API is limited.</w:t>
+        <w:t xml:space="preserve">Dish codes already link sales to the menu, so matching sales to our recipes is reliable.</w:t>
+      </w:r>
+    </w:p>
+    <w:p>
+      <w:pPr>
+        <w:pStyle w:val="ListParagraph"/>
+        <w:numPr>
+          <w:ilvl w:val="0"/>
+          <w:numId w:val="2"/>
+        </w:numPr>
+        <w:spacing w:after="60"/>
+      </w:pPr>
+      <w:r>
+        <w:t xml:space="preserve">Prices differ by branch and channel, so catalog editing must handle more than one price per dish (Q39).</w:t>
+      </w:r>
+    </w:p>
+    <w:p>
+      <w:pPr>
+        <w:pStyle w:val="ListParagraph"/>
+        <w:numPr>
+          <w:ilvl w:val="0"/>
+          <w:numId w:val="2"/>
+        </w:numPr>
+        <w:spacing w:after="60"/>
+      </w:pPr>
+      <w:r>
+        <w:t xml:space="preserve">Rista already supports bulk Excel uploads, so menu changes have a fallback even if the API is limited.</w:t>
       </w:r>
     </w:p>
     <w:p>
@@ -4088,7 +4317,7 @@
                 <w:sz w:val="20"/>
                 <w:szCs w:val="20"/>
               </w:rPr>
-              <w:t xml:space="preserve">Every night, one branch and one day at a time, which stays within Rista's limits. Admins also get a "refresh now" button.</w:t>
+              <w:t xml:space="preserve">Until the API is ready: an admin uploads Rista's downloaded sales file (one month, all branches) and the website loads it, skipping lines it already has. Once the API is ready: every night for the previous day, plus a "refresh now" button for admins.</w:t>
             </w:r>
           </w:p>
         </w:tc>
@@ -4216,7 +4445,7 @@
                 <w:sz w:val="20"/>
                 <w:szCs w:val="20"/>
               </w:rPr>
-              <w:t xml:space="preserve">Taken from Rista's cancelled transactions, listed separately and left out of sales totals.</w:t>
+              <w:t xml:space="preserve">Taken from Rista's "Cancelled Transactions" report, listed separately with the reason, and left out of sales totals (Rista already leaves them out).</w:t>
             </w:r>
           </w:p>
         </w:tc>
@@ -4344,7 +4573,7 @@
                 <w:sz w:val="20"/>
                 <w:szCs w:val="20"/>
               </w:rPr>
-              <w:t xml:space="preserve">By Rista's dish code (SKU, for example GIA001). Options and add-ons are linked to the dish they were sold with.</w:t>
+              <w:t xml:space="preserve">By Rista's dish code (SKU, for example GIA001), checked against the menu export. Options and add-ons are linked to the dish they were sold with. Codes that do not match are listed for an admin to fix.</w:t>
             </w:r>
           </w:p>
         </w:tc>
@@ -4856,7 +5085,7 @@
                 <w:sz w:val="20"/>
                 <w:szCs w:val="20"/>
               </w:rPr>
-              <w:t xml:space="preserve">Use Rista's Price book for different Swiggy, Zomato and in-store prices, if the API allows it.</w:t>
+              <w:t xml:space="preserve">Keep one price per branch and channel, exactly as Rista does, and send them through Rista's price settings if the API allows it.</w:t>
             </w:r>
           </w:p>
         </w:tc>
@@ -6818,7 +7047,7 @@
                 <w:sz w:val="20"/>
                 <w:szCs w:val="20"/>
               </w:rPr>
-              <w:t xml:space="preserve">A food brand sold to customers, for example Kochi Kurry Klub. In Rista sales this is the "Business Brand".</w:t>
+              <w:t xml:space="preserve">A food brand sold to customers, for example Kochi Kurry Klub. Rista sales carry both a "Business Brand" and an "Account Name" (see Q15).</w:t>
             </w:r>
           </w:p>
         </w:tc>
@@ -9656,7 +9885,7 @@
                 <w:sz w:val="20"/>
                 <w:szCs w:val="20"/>
               </w:rPr>
-              <w:t xml:space="preserve">Section 8 lists the 13 brands found in the sales data. Please add the client company that owns each brand, and correct anything wrong.</w:t>
+              <w:t xml:space="preserve">Section 8 lists the 13 brands with sales and the 8 brands that have a menu but no sales this month. Please add the client company that owns each brand, mark any brand that has stopped, and correct anything wrong.</w:t>
             </w:r>
           </w:p>
         </w:tc>
@@ -9818,7 +10047,7 @@
                 <w:sz w:val="20"/>
                 <w:szCs w:val="20"/>
               </w:rPr>
-              <w:t xml:space="preserve">Rista has 5 branches, but all sales came from JP Nagar and Marathahalli. What are the other 3, and are they still used?</w:t>
+              <w:t xml:space="preserve">Rista has 5 branches, but all sales came from JP Nagar and Marathahalli. The menu also has prices for Jayanagar, Kalyan Nagar and Koramangala. Are those the other 3, and are any of them still used or opening again?</w:t>
             </w:r>
           </w:p>
         </w:tc>
@@ -10142,7 +10371,7 @@
                 <w:sz w:val="20"/>
                 <w:szCs w:val="20"/>
               </w:rPr>
-              <w:t xml:space="preserve">Each sale has a "Business Brand" and an "Account Name", and they do not always match (see section 3). Which one decides who owns a sale, and therefore which client can see it?</w:t>
+              <w:t xml:space="preserve">Each sale has a "Business Brand" and an "Account Name", and they do not always match (see section 3). The data suggests the Business Brand is the brand the customer ordered from, and the Account Name is the brand that owns the dish. Which one decides who owns a sale, and therefore which client can see it?</w:t>
             </w:r>
           </w:p>
           <w:p>
@@ -10155,7 +10384,7 @@
                 <w:sz w:val="20"/>
                 <w:szCs w:val="20"/>
               </w:rPr>
-              <w:t xml:space="preserve">A) Business Brand</w:t>
+              <w:t xml:space="preserve">A) Business Brand (the brand the customer ordered from)</w:t>
             </w:r>
           </w:p>
           <w:p>
@@ -10168,7 +10397,7 @@
                 <w:sz w:val="20"/>
                 <w:szCs w:val="20"/>
               </w:rPr>
-              <w:t xml:space="preserve">B) Account Name</w:t>
+              <w:t xml:space="preserve">B) Account Name (the brand that owns the dish)</w:t>
             </w:r>
           </w:p>
           <w:p>
@@ -10343,7 +10572,7 @@
                 <w:sz w:val="20"/>
                 <w:szCs w:val="20"/>
               </w:rPr>
-              <w:t xml:space="preserve">What are Chicbun, Corporate Menu, ODC Event, General and The Good Fud? They appear as account names in Rista but not as brands.</w:t>
+              <w:t xml:space="preserve">What are Chicbun, Corporate Menu, ODC Event, General and The Good Fud? They appear as account names in Rista but never as the brand of a sale. Is "The Good Fud" the same as "The Healthy Fud"?</w:t>
             </w:r>
           </w:p>
         </w:tc>
@@ -15573,7 +15802,46 @@
                 <w:sz w:val="20"/>
                 <w:szCs w:val="20"/>
               </w:rPr>
-              <w:t xml:space="preserve">Do you use Rista's Price book today? Do prices differ between Swiggy, Zomato and in-store, or between branches?</w:t>
+              <w:t xml:space="preserve">The menu has a separate price for each branch and channel (for example, at JP Nagar the Puttu + Kadala Curry Combo is ₹129 for takeaway, ₹149 in-store and ₹185 on Swiggy and Zomato). How should brand owners change prices?</w:t>
+            </w:r>
+          </w:p>
+          <w:p>
+            <w:pPr>
+              <w:spacing w:after="40" w:line="252"/>
+              <w:ind w:left="200"/>
+            </w:pPr>
+            <w:r>
+              <w:rPr>
+                <w:sz w:val="20"/>
+                <w:szCs w:val="20"/>
+              </w:rPr>
+              <w:t xml:space="preserve">A) Edit each branch and channel price separately</w:t>
+            </w:r>
+          </w:p>
+          <w:p>
+            <w:pPr>
+              <w:spacing w:after="40" w:line="252"/>
+              <w:ind w:left="200"/>
+            </w:pPr>
+            <w:r>
+              <w:rPr>
+                <w:sz w:val="20"/>
+                <w:szCs w:val="20"/>
+              </w:rPr>
+              <w:t xml:space="preserve">B) Edit one base price; channel prices follow a fixed rule (please give the rule)</w:t>
+            </w:r>
+          </w:p>
+          <w:p>
+            <w:pPr>
+              <w:spacing w:after="40" w:line="252"/>
+              <w:ind w:left="200"/>
+            </w:pPr>
+            <w:r>
+              <w:rPr>
+                <w:sz w:val="20"/>
+                <w:szCs w:val="20"/>
+              </w:rPr>
+              <w:t xml:space="preserve">C) Only our admin changes prices</w:t>
             </w:r>
           </w:p>
         </w:tc>
@@ -15603,7 +15871,7 @@
                 <w:sz w:val="20"/>
                 <w:szCs w:val="20"/>
               </w:rPr>
-              <w:t xml:space="preserve">Short answer</w:t>
+              <w:t xml:space="preserve">Pick one</w:t>
             </w:r>
           </w:p>
         </w:tc>
@@ -18567,7 +18835,20 @@
                 <w:sz w:val="20"/>
                 <w:szCs w:val="20"/>
               </w:rPr>
-              <w:t xml:space="preserve">F) Set channel prices through the Price book</w:t>
+              <w:t xml:space="preserve">F) Set a different price for each branch and channel</w:t>
+            </w:r>
+          </w:p>
+          <w:p>
+            <w:pPr>
+              <w:spacing w:after="40" w:line="252"/>
+              <w:ind w:left="200"/>
+            </w:pPr>
+            <w:r>
+              <w:rPr>
+                <w:sz w:val="20"/>
+                <w:szCs w:val="20"/>
+              </w:rPr>
+              <w:t xml:space="preserve">G) Read the full menu (today "Export Items" only arrives by email)</w:t>
             </w:r>
           </w:p>
         </w:tc>
@@ -18729,7 +19010,7 @@
                 <w:sz w:val="20"/>
                 <w:szCs w:val="20"/>
               </w:rPr>
-              <w:t xml:space="preserve">Can Rista notify us instantly when a new order arrives, or must we check regularly? Does the API have limits like the screen (7 days and 1 branch per report)?</w:t>
+              <w:t xml:space="preserve">Can Rista notify us instantly when a new order arrives, or must we check regularly? Does the API have limits on dates or branches, like the screen (7 days per report)?</w:t>
             </w:r>
           </w:p>
         </w:tc>
@@ -19009,7 +19290,7 @@
         <w:spacing w:after="120" w:line="276"/>
       </w:pPr>
       <w:r>
-        <w:t xml:space="preserve">Taken from the sales data (19 September to 19 October 2026). Please fill in the client company that owns each brand (question Q12) and correct anything wrong. Add any brand that is missing.</w:t>
+        <w:t xml:space="preserve">Taken from the sales data (19 September to 19 October 2026) and the menu export. The last 8 brands have a menu in Rista but no sales this month. Please fill in the client company that owns each brand (question Q12), mark any brand that has stopped, and correct anything wrong. Add any brand that is missing.</w:t>
       </w:r>
     </w:p>
     <w:tbl>
@@ -22083,6 +22364,1774 @@
                 <w:szCs w:val="20"/>
               </w:rPr>
               <w:t xml:space="preserve">0.1%</w:t>
+            </w:r>
+          </w:p>
+        </w:tc>
+        <w:tc>
+          <w:tcPr>
+            <w:tcW w:type="dxa" w:w="1946"/>
+            <w:tcBorders>
+              <w:top w:val="single" w:color="BFBFBF" w:sz="4"/>
+              <w:left w:val="single" w:color="BFBFBF" w:sz="4"/>
+              <w:bottom w:val="single" w:color="BFBFBF" w:sz="4"/>
+              <w:right w:val="single" w:color="BFBFBF" w:sz="4"/>
+            </w:tcBorders>
+            <w:shd w:fill="FFF7D6" w:color="auto" w:val="clear"/>
+            <w:tcMar>
+              <w:top w:type="dxa" w:w="70"/>
+              <w:left w:type="dxa" w:w="110"/>
+              <w:bottom w:type="dxa" w:w="70"/>
+              <w:right w:type="dxa" w:w="110"/>
+            </w:tcMar>
+            <w:vAlign w:val="top"/>
+          </w:tcPr>
+          <w:p>
+            <w:pPr>
+              <w:spacing w:after="40" w:line="252"/>
+            </w:pPr>
+            <w:r>
+              <w:rPr>
+                <w:sz w:val="20"/>
+                <w:szCs w:val="20"/>
+              </w:rPr>
+              <w:t xml:space="preserve"/>
+            </w:r>
+          </w:p>
+        </w:tc>
+        <w:tc>
+          <w:tcPr>
+            <w:tcW w:type="dxa" w:w="1500"/>
+            <w:tcBorders>
+              <w:top w:val="single" w:color="BFBFBF" w:sz="4"/>
+              <w:left w:val="single" w:color="BFBFBF" w:sz="4"/>
+              <w:bottom w:val="single" w:color="BFBFBF" w:sz="4"/>
+              <w:right w:val="single" w:color="BFBFBF" w:sz="4"/>
+            </w:tcBorders>
+            <w:shd w:fill="FFF7D6" w:color="auto" w:val="clear"/>
+            <w:tcMar>
+              <w:top w:type="dxa" w:w="70"/>
+              <w:left w:type="dxa" w:w="110"/>
+              <w:bottom w:type="dxa" w:w="70"/>
+              <w:right w:type="dxa" w:w="110"/>
+            </w:tcMar>
+            <w:vAlign w:val="top"/>
+          </w:tcPr>
+          <w:p>
+            <w:pPr>
+              <w:spacing w:after="40" w:line="252"/>
+            </w:pPr>
+            <w:r>
+              <w:rPr>
+                <w:sz w:val="20"/>
+                <w:szCs w:val="20"/>
+              </w:rPr>
+              <w:t xml:space="preserve"/>
+            </w:r>
+          </w:p>
+        </w:tc>
+      </w:tr>
+      <w:tr>
+        <w:trPr>
+          <w:cantSplit/>
+        </w:trPr>
+        <w:tc>
+          <w:tcPr>
+            <w:tcW w:type="dxa" w:w="1750"/>
+            <w:tcBorders>
+              <w:top w:val="single" w:color="BFBFBF" w:sz="4"/>
+              <w:left w:val="single" w:color="BFBFBF" w:sz="4"/>
+              <w:bottom w:val="single" w:color="BFBFBF" w:sz="4"/>
+              <w:right w:val="single" w:color="BFBFBF" w:sz="4"/>
+            </w:tcBorders>
+            <w:tcMar>
+              <w:top w:type="dxa" w:w="70"/>
+              <w:left w:type="dxa" w:w="110"/>
+              <w:bottom w:type="dxa" w:w="70"/>
+              <w:right w:type="dxa" w:w="110"/>
+            </w:tcMar>
+            <w:vAlign w:val="top"/>
+          </w:tcPr>
+          <w:p>
+            <w:pPr>
+              <w:spacing w:after="40" w:line="252"/>
+            </w:pPr>
+            <w:r>
+              <w:rPr>
+                <w:b/>
+                <w:bCs/>
+                <w:sz w:val="20"/>
+                <w:szCs w:val="20"/>
+              </w:rPr>
+              <w:t xml:space="preserve">Punjabi House</w:t>
+            </w:r>
+          </w:p>
+        </w:tc>
+        <w:tc>
+          <w:tcPr>
+            <w:tcW w:type="dxa" w:w="1300"/>
+            <w:tcBorders>
+              <w:top w:val="single" w:color="BFBFBF" w:sz="4"/>
+              <w:left w:val="single" w:color="BFBFBF" w:sz="4"/>
+              <w:bottom w:val="single" w:color="BFBFBF" w:sz="4"/>
+              <w:right w:val="single" w:color="BFBFBF" w:sz="4"/>
+            </w:tcBorders>
+            <w:tcMar>
+              <w:top w:type="dxa" w:w="70"/>
+              <w:left w:type="dxa" w:w="110"/>
+              <w:bottom w:type="dxa" w:w="70"/>
+              <w:right w:type="dxa" w:w="110"/>
+            </w:tcMar>
+            <w:vAlign w:val="top"/>
+          </w:tcPr>
+          <w:p>
+            <w:pPr>
+              <w:spacing w:after="40" w:line="252"/>
+            </w:pPr>
+            <w:r>
+              <w:rPr>
+                <w:sz w:val="20"/>
+                <w:szCs w:val="20"/>
+              </w:rPr>
+              <w:t xml:space="preserve">None this month</w:t>
+            </w:r>
+          </w:p>
+        </w:tc>
+        <w:tc>
+          <w:tcPr>
+            <w:tcW w:type="dxa" w:w="1600"/>
+            <w:tcBorders>
+              <w:top w:val="single" w:color="BFBFBF" w:sz="4"/>
+              <w:left w:val="single" w:color="BFBFBF" w:sz="4"/>
+              <w:bottom w:val="single" w:color="BFBFBF" w:sz="4"/>
+              <w:right w:val="single" w:color="BFBFBF" w:sz="4"/>
+            </w:tcBorders>
+            <w:tcMar>
+              <w:top w:type="dxa" w:w="70"/>
+              <w:left w:type="dxa" w:w="110"/>
+              <w:bottom w:type="dxa" w:w="70"/>
+              <w:right w:type="dxa" w:w="110"/>
+            </w:tcMar>
+            <w:vAlign w:val="top"/>
+          </w:tcPr>
+          <w:p>
+            <w:pPr>
+              <w:spacing w:after="40" w:line="252"/>
+            </w:pPr>
+            <w:r>
+              <w:rPr>
+                <w:sz w:val="20"/>
+                <w:szCs w:val="20"/>
+              </w:rPr>
+              <w:t xml:space="preserve">Menu only (169 dishes), no sales</w:t>
+            </w:r>
+          </w:p>
+        </w:tc>
+        <w:tc>
+          <w:tcPr>
+            <w:tcW w:type="dxa" w:w="850"/>
+            <w:tcBorders>
+              <w:top w:val="single" w:color="BFBFBF" w:sz="4"/>
+              <w:left w:val="single" w:color="BFBFBF" w:sz="4"/>
+              <w:bottom w:val="single" w:color="BFBFBF" w:sz="4"/>
+              <w:right w:val="single" w:color="BFBFBF" w:sz="4"/>
+            </w:tcBorders>
+            <w:tcMar>
+              <w:top w:type="dxa" w:w="70"/>
+              <w:left w:type="dxa" w:w="110"/>
+              <w:bottom w:type="dxa" w:w="70"/>
+              <w:right w:type="dxa" w:w="110"/>
+            </w:tcMar>
+            <w:vAlign w:val="top"/>
+          </w:tcPr>
+          <w:p>
+            <w:pPr>
+              <w:spacing w:after="40" w:line="252"/>
+              <w:jc w:val="right"/>
+            </w:pPr>
+            <w:r>
+              <w:rPr>
+                <w:sz w:val="20"/>
+                <w:szCs w:val="20"/>
+              </w:rPr>
+              <w:t xml:space="preserve">0</w:t>
+            </w:r>
+          </w:p>
+        </w:tc>
+        <w:tc>
+          <w:tcPr>
+            <w:tcW w:type="dxa" w:w="800"/>
+            <w:tcBorders>
+              <w:top w:val="single" w:color="BFBFBF" w:sz="4"/>
+              <w:left w:val="single" w:color="BFBFBF" w:sz="4"/>
+              <w:bottom w:val="single" w:color="BFBFBF" w:sz="4"/>
+              <w:right w:val="single" w:color="BFBFBF" w:sz="4"/>
+            </w:tcBorders>
+            <w:tcMar>
+              <w:top w:type="dxa" w:w="70"/>
+              <w:left w:type="dxa" w:w="110"/>
+              <w:bottom w:type="dxa" w:w="70"/>
+              <w:right w:type="dxa" w:w="110"/>
+            </w:tcMar>
+            <w:vAlign w:val="top"/>
+          </w:tcPr>
+          <w:p>
+            <w:pPr>
+              <w:spacing w:after="40" w:line="252"/>
+              <w:jc w:val="right"/>
+            </w:pPr>
+            <w:r>
+              <w:rPr>
+                <w:sz w:val="20"/>
+                <w:szCs w:val="20"/>
+              </w:rPr>
+              <w:t xml:space="preserve">0%</w:t>
+            </w:r>
+          </w:p>
+        </w:tc>
+        <w:tc>
+          <w:tcPr>
+            <w:tcW w:type="dxa" w:w="1946"/>
+            <w:tcBorders>
+              <w:top w:val="single" w:color="BFBFBF" w:sz="4"/>
+              <w:left w:val="single" w:color="BFBFBF" w:sz="4"/>
+              <w:bottom w:val="single" w:color="BFBFBF" w:sz="4"/>
+              <w:right w:val="single" w:color="BFBFBF" w:sz="4"/>
+            </w:tcBorders>
+            <w:shd w:fill="FFF7D6" w:color="auto" w:val="clear"/>
+            <w:tcMar>
+              <w:top w:type="dxa" w:w="70"/>
+              <w:left w:type="dxa" w:w="110"/>
+              <w:bottom w:type="dxa" w:w="70"/>
+              <w:right w:type="dxa" w:w="110"/>
+            </w:tcMar>
+            <w:vAlign w:val="top"/>
+          </w:tcPr>
+          <w:p>
+            <w:pPr>
+              <w:spacing w:after="40" w:line="252"/>
+            </w:pPr>
+            <w:r>
+              <w:rPr>
+                <w:sz w:val="20"/>
+                <w:szCs w:val="20"/>
+              </w:rPr>
+              <w:t xml:space="preserve"/>
+            </w:r>
+          </w:p>
+        </w:tc>
+        <w:tc>
+          <w:tcPr>
+            <w:tcW w:type="dxa" w:w="1500"/>
+            <w:tcBorders>
+              <w:top w:val="single" w:color="BFBFBF" w:sz="4"/>
+              <w:left w:val="single" w:color="BFBFBF" w:sz="4"/>
+              <w:bottom w:val="single" w:color="BFBFBF" w:sz="4"/>
+              <w:right w:val="single" w:color="BFBFBF" w:sz="4"/>
+            </w:tcBorders>
+            <w:shd w:fill="FFF7D6" w:color="auto" w:val="clear"/>
+            <w:tcMar>
+              <w:top w:type="dxa" w:w="70"/>
+              <w:left w:type="dxa" w:w="110"/>
+              <w:bottom w:type="dxa" w:w="70"/>
+              <w:right w:type="dxa" w:w="110"/>
+            </w:tcMar>
+            <w:vAlign w:val="top"/>
+          </w:tcPr>
+          <w:p>
+            <w:pPr>
+              <w:spacing w:after="40" w:line="252"/>
+            </w:pPr>
+            <w:r>
+              <w:rPr>
+                <w:sz w:val="20"/>
+                <w:szCs w:val="20"/>
+              </w:rPr>
+              <w:t xml:space="preserve"/>
+            </w:r>
+          </w:p>
+        </w:tc>
+      </w:tr>
+      <w:tr>
+        <w:trPr>
+          <w:cantSplit/>
+        </w:trPr>
+        <w:tc>
+          <w:tcPr>
+            <w:tcW w:type="dxa" w:w="1750"/>
+            <w:tcBorders>
+              <w:top w:val="single" w:color="BFBFBF" w:sz="4"/>
+              <w:left w:val="single" w:color="BFBFBF" w:sz="4"/>
+              <w:bottom w:val="single" w:color="BFBFBF" w:sz="4"/>
+              <w:right w:val="single" w:color="BFBFBF" w:sz="4"/>
+            </w:tcBorders>
+            <w:tcMar>
+              <w:top w:type="dxa" w:w="70"/>
+              <w:left w:type="dxa" w:w="110"/>
+              <w:bottom w:type="dxa" w:w="70"/>
+              <w:right w:type="dxa" w:w="110"/>
+            </w:tcMar>
+            <w:vAlign w:val="top"/>
+          </w:tcPr>
+          <w:p>
+            <w:pPr>
+              <w:spacing w:after="40" w:line="252"/>
+            </w:pPr>
+            <w:r>
+              <w:rPr>
+                <w:b/>
+                <w:bCs/>
+                <w:sz w:val="20"/>
+                <w:szCs w:val="20"/>
+              </w:rPr>
+              <w:t xml:space="preserve">Bao Bangalore</w:t>
+            </w:r>
+          </w:p>
+        </w:tc>
+        <w:tc>
+          <w:tcPr>
+            <w:tcW w:type="dxa" w:w="1300"/>
+            <w:tcBorders>
+              <w:top w:val="single" w:color="BFBFBF" w:sz="4"/>
+              <w:left w:val="single" w:color="BFBFBF" w:sz="4"/>
+              <w:bottom w:val="single" w:color="BFBFBF" w:sz="4"/>
+              <w:right w:val="single" w:color="BFBFBF" w:sz="4"/>
+            </w:tcBorders>
+            <w:tcMar>
+              <w:top w:type="dxa" w:w="70"/>
+              <w:left w:type="dxa" w:w="110"/>
+              <w:bottom w:type="dxa" w:w="70"/>
+              <w:right w:type="dxa" w:w="110"/>
+            </w:tcMar>
+            <w:vAlign w:val="top"/>
+          </w:tcPr>
+          <w:p>
+            <w:pPr>
+              <w:spacing w:after="40" w:line="252"/>
+            </w:pPr>
+            <w:r>
+              <w:rPr>
+                <w:sz w:val="20"/>
+                <w:szCs w:val="20"/>
+              </w:rPr>
+              <w:t xml:space="preserve">None this month</w:t>
+            </w:r>
+          </w:p>
+        </w:tc>
+        <w:tc>
+          <w:tcPr>
+            <w:tcW w:type="dxa" w:w="1600"/>
+            <w:tcBorders>
+              <w:top w:val="single" w:color="BFBFBF" w:sz="4"/>
+              <w:left w:val="single" w:color="BFBFBF" w:sz="4"/>
+              <w:bottom w:val="single" w:color="BFBFBF" w:sz="4"/>
+              <w:right w:val="single" w:color="BFBFBF" w:sz="4"/>
+            </w:tcBorders>
+            <w:tcMar>
+              <w:top w:type="dxa" w:w="70"/>
+              <w:left w:type="dxa" w:w="110"/>
+              <w:bottom w:type="dxa" w:w="70"/>
+              <w:right w:type="dxa" w:w="110"/>
+            </w:tcMar>
+            <w:vAlign w:val="top"/>
+          </w:tcPr>
+          <w:p>
+            <w:pPr>
+              <w:spacing w:after="40" w:line="252"/>
+            </w:pPr>
+            <w:r>
+              <w:rPr>
+                <w:sz w:val="20"/>
+                <w:szCs w:val="20"/>
+              </w:rPr>
+              <w:t xml:space="preserve">Menu only (67 dishes), no sales</w:t>
+            </w:r>
+          </w:p>
+        </w:tc>
+        <w:tc>
+          <w:tcPr>
+            <w:tcW w:type="dxa" w:w="850"/>
+            <w:tcBorders>
+              <w:top w:val="single" w:color="BFBFBF" w:sz="4"/>
+              <w:left w:val="single" w:color="BFBFBF" w:sz="4"/>
+              <w:bottom w:val="single" w:color="BFBFBF" w:sz="4"/>
+              <w:right w:val="single" w:color="BFBFBF" w:sz="4"/>
+            </w:tcBorders>
+            <w:tcMar>
+              <w:top w:type="dxa" w:w="70"/>
+              <w:left w:type="dxa" w:w="110"/>
+              <w:bottom w:type="dxa" w:w="70"/>
+              <w:right w:type="dxa" w:w="110"/>
+            </w:tcMar>
+            <w:vAlign w:val="top"/>
+          </w:tcPr>
+          <w:p>
+            <w:pPr>
+              <w:spacing w:after="40" w:line="252"/>
+              <w:jc w:val="right"/>
+            </w:pPr>
+            <w:r>
+              <w:rPr>
+                <w:sz w:val="20"/>
+                <w:szCs w:val="20"/>
+              </w:rPr>
+              <w:t xml:space="preserve">0</w:t>
+            </w:r>
+          </w:p>
+        </w:tc>
+        <w:tc>
+          <w:tcPr>
+            <w:tcW w:type="dxa" w:w="800"/>
+            <w:tcBorders>
+              <w:top w:val="single" w:color="BFBFBF" w:sz="4"/>
+              <w:left w:val="single" w:color="BFBFBF" w:sz="4"/>
+              <w:bottom w:val="single" w:color="BFBFBF" w:sz="4"/>
+              <w:right w:val="single" w:color="BFBFBF" w:sz="4"/>
+            </w:tcBorders>
+            <w:tcMar>
+              <w:top w:type="dxa" w:w="70"/>
+              <w:left w:type="dxa" w:w="110"/>
+              <w:bottom w:type="dxa" w:w="70"/>
+              <w:right w:type="dxa" w:w="110"/>
+            </w:tcMar>
+            <w:vAlign w:val="top"/>
+          </w:tcPr>
+          <w:p>
+            <w:pPr>
+              <w:spacing w:after="40" w:line="252"/>
+              <w:jc w:val="right"/>
+            </w:pPr>
+            <w:r>
+              <w:rPr>
+                <w:sz w:val="20"/>
+                <w:szCs w:val="20"/>
+              </w:rPr>
+              <w:t xml:space="preserve">0%</w:t>
+            </w:r>
+          </w:p>
+        </w:tc>
+        <w:tc>
+          <w:tcPr>
+            <w:tcW w:type="dxa" w:w="1946"/>
+            <w:tcBorders>
+              <w:top w:val="single" w:color="BFBFBF" w:sz="4"/>
+              <w:left w:val="single" w:color="BFBFBF" w:sz="4"/>
+              <w:bottom w:val="single" w:color="BFBFBF" w:sz="4"/>
+              <w:right w:val="single" w:color="BFBFBF" w:sz="4"/>
+            </w:tcBorders>
+            <w:shd w:fill="FFF7D6" w:color="auto" w:val="clear"/>
+            <w:tcMar>
+              <w:top w:type="dxa" w:w="70"/>
+              <w:left w:type="dxa" w:w="110"/>
+              <w:bottom w:type="dxa" w:w="70"/>
+              <w:right w:type="dxa" w:w="110"/>
+            </w:tcMar>
+            <w:vAlign w:val="top"/>
+          </w:tcPr>
+          <w:p>
+            <w:pPr>
+              <w:spacing w:after="40" w:line="252"/>
+            </w:pPr>
+            <w:r>
+              <w:rPr>
+                <w:sz w:val="20"/>
+                <w:szCs w:val="20"/>
+              </w:rPr>
+              <w:t xml:space="preserve"/>
+            </w:r>
+          </w:p>
+        </w:tc>
+        <w:tc>
+          <w:tcPr>
+            <w:tcW w:type="dxa" w:w="1500"/>
+            <w:tcBorders>
+              <w:top w:val="single" w:color="BFBFBF" w:sz="4"/>
+              <w:left w:val="single" w:color="BFBFBF" w:sz="4"/>
+              <w:bottom w:val="single" w:color="BFBFBF" w:sz="4"/>
+              <w:right w:val="single" w:color="BFBFBF" w:sz="4"/>
+            </w:tcBorders>
+            <w:shd w:fill="FFF7D6" w:color="auto" w:val="clear"/>
+            <w:tcMar>
+              <w:top w:type="dxa" w:w="70"/>
+              <w:left w:type="dxa" w:w="110"/>
+              <w:bottom w:type="dxa" w:w="70"/>
+              <w:right w:type="dxa" w:w="110"/>
+            </w:tcMar>
+            <w:vAlign w:val="top"/>
+          </w:tcPr>
+          <w:p>
+            <w:pPr>
+              <w:spacing w:after="40" w:line="252"/>
+            </w:pPr>
+            <w:r>
+              <w:rPr>
+                <w:sz w:val="20"/>
+                <w:szCs w:val="20"/>
+              </w:rPr>
+              <w:t xml:space="preserve"/>
+            </w:r>
+          </w:p>
+        </w:tc>
+      </w:tr>
+      <w:tr>
+        <w:trPr>
+          <w:cantSplit/>
+        </w:trPr>
+        <w:tc>
+          <w:tcPr>
+            <w:tcW w:type="dxa" w:w="1750"/>
+            <w:tcBorders>
+              <w:top w:val="single" w:color="BFBFBF" w:sz="4"/>
+              <w:left w:val="single" w:color="BFBFBF" w:sz="4"/>
+              <w:bottom w:val="single" w:color="BFBFBF" w:sz="4"/>
+              <w:right w:val="single" w:color="BFBFBF" w:sz="4"/>
+            </w:tcBorders>
+            <w:tcMar>
+              <w:top w:type="dxa" w:w="70"/>
+              <w:left w:type="dxa" w:w="110"/>
+              <w:bottom w:type="dxa" w:w="70"/>
+              <w:right w:type="dxa" w:w="110"/>
+            </w:tcMar>
+            <w:vAlign w:val="top"/>
+          </w:tcPr>
+          <w:p>
+            <w:pPr>
+              <w:spacing w:after="40" w:line="252"/>
+            </w:pPr>
+            <w:r>
+              <w:rPr>
+                <w:b/>
+                <w:bCs/>
+                <w:sz w:val="20"/>
+                <w:szCs w:val="20"/>
+              </w:rPr>
+              <w:t xml:space="preserve">Kritunga</w:t>
+            </w:r>
+          </w:p>
+        </w:tc>
+        <w:tc>
+          <w:tcPr>
+            <w:tcW w:type="dxa" w:w="1300"/>
+            <w:tcBorders>
+              <w:top w:val="single" w:color="BFBFBF" w:sz="4"/>
+              <w:left w:val="single" w:color="BFBFBF" w:sz="4"/>
+              <w:bottom w:val="single" w:color="BFBFBF" w:sz="4"/>
+              <w:right w:val="single" w:color="BFBFBF" w:sz="4"/>
+            </w:tcBorders>
+            <w:tcMar>
+              <w:top w:type="dxa" w:w="70"/>
+              <w:left w:type="dxa" w:w="110"/>
+              <w:bottom w:type="dxa" w:w="70"/>
+              <w:right w:type="dxa" w:w="110"/>
+            </w:tcMar>
+            <w:vAlign w:val="top"/>
+          </w:tcPr>
+          <w:p>
+            <w:pPr>
+              <w:spacing w:after="40" w:line="252"/>
+            </w:pPr>
+            <w:r>
+              <w:rPr>
+                <w:sz w:val="20"/>
+                <w:szCs w:val="20"/>
+              </w:rPr>
+              <w:t xml:space="preserve">None this month</w:t>
+            </w:r>
+          </w:p>
+        </w:tc>
+        <w:tc>
+          <w:tcPr>
+            <w:tcW w:type="dxa" w:w="1600"/>
+            <w:tcBorders>
+              <w:top w:val="single" w:color="BFBFBF" w:sz="4"/>
+              <w:left w:val="single" w:color="BFBFBF" w:sz="4"/>
+              <w:bottom w:val="single" w:color="BFBFBF" w:sz="4"/>
+              <w:right w:val="single" w:color="BFBFBF" w:sz="4"/>
+            </w:tcBorders>
+            <w:tcMar>
+              <w:top w:type="dxa" w:w="70"/>
+              <w:left w:type="dxa" w:w="110"/>
+              <w:bottom w:type="dxa" w:w="70"/>
+              <w:right w:type="dxa" w:w="110"/>
+            </w:tcMar>
+            <w:vAlign w:val="top"/>
+          </w:tcPr>
+          <w:p>
+            <w:pPr>
+              <w:spacing w:after="40" w:line="252"/>
+            </w:pPr>
+            <w:r>
+              <w:rPr>
+                <w:sz w:val="20"/>
+                <w:szCs w:val="20"/>
+              </w:rPr>
+              <w:t xml:space="preserve">Menu only (45 dishes), no sales</w:t>
+            </w:r>
+          </w:p>
+        </w:tc>
+        <w:tc>
+          <w:tcPr>
+            <w:tcW w:type="dxa" w:w="850"/>
+            <w:tcBorders>
+              <w:top w:val="single" w:color="BFBFBF" w:sz="4"/>
+              <w:left w:val="single" w:color="BFBFBF" w:sz="4"/>
+              <w:bottom w:val="single" w:color="BFBFBF" w:sz="4"/>
+              <w:right w:val="single" w:color="BFBFBF" w:sz="4"/>
+            </w:tcBorders>
+            <w:tcMar>
+              <w:top w:type="dxa" w:w="70"/>
+              <w:left w:type="dxa" w:w="110"/>
+              <w:bottom w:type="dxa" w:w="70"/>
+              <w:right w:type="dxa" w:w="110"/>
+            </w:tcMar>
+            <w:vAlign w:val="top"/>
+          </w:tcPr>
+          <w:p>
+            <w:pPr>
+              <w:spacing w:after="40" w:line="252"/>
+              <w:jc w:val="right"/>
+            </w:pPr>
+            <w:r>
+              <w:rPr>
+                <w:sz w:val="20"/>
+                <w:szCs w:val="20"/>
+              </w:rPr>
+              <w:t xml:space="preserve">0</w:t>
+            </w:r>
+          </w:p>
+        </w:tc>
+        <w:tc>
+          <w:tcPr>
+            <w:tcW w:type="dxa" w:w="800"/>
+            <w:tcBorders>
+              <w:top w:val="single" w:color="BFBFBF" w:sz="4"/>
+              <w:left w:val="single" w:color="BFBFBF" w:sz="4"/>
+              <w:bottom w:val="single" w:color="BFBFBF" w:sz="4"/>
+              <w:right w:val="single" w:color="BFBFBF" w:sz="4"/>
+            </w:tcBorders>
+            <w:tcMar>
+              <w:top w:type="dxa" w:w="70"/>
+              <w:left w:type="dxa" w:w="110"/>
+              <w:bottom w:type="dxa" w:w="70"/>
+              <w:right w:type="dxa" w:w="110"/>
+            </w:tcMar>
+            <w:vAlign w:val="top"/>
+          </w:tcPr>
+          <w:p>
+            <w:pPr>
+              <w:spacing w:after="40" w:line="252"/>
+              <w:jc w:val="right"/>
+            </w:pPr>
+            <w:r>
+              <w:rPr>
+                <w:sz w:val="20"/>
+                <w:szCs w:val="20"/>
+              </w:rPr>
+              <w:t xml:space="preserve">0%</w:t>
+            </w:r>
+          </w:p>
+        </w:tc>
+        <w:tc>
+          <w:tcPr>
+            <w:tcW w:type="dxa" w:w="1946"/>
+            <w:tcBorders>
+              <w:top w:val="single" w:color="BFBFBF" w:sz="4"/>
+              <w:left w:val="single" w:color="BFBFBF" w:sz="4"/>
+              <w:bottom w:val="single" w:color="BFBFBF" w:sz="4"/>
+              <w:right w:val="single" w:color="BFBFBF" w:sz="4"/>
+            </w:tcBorders>
+            <w:shd w:fill="FFF7D6" w:color="auto" w:val="clear"/>
+            <w:tcMar>
+              <w:top w:type="dxa" w:w="70"/>
+              <w:left w:type="dxa" w:w="110"/>
+              <w:bottom w:type="dxa" w:w="70"/>
+              <w:right w:type="dxa" w:w="110"/>
+            </w:tcMar>
+            <w:vAlign w:val="top"/>
+          </w:tcPr>
+          <w:p>
+            <w:pPr>
+              <w:spacing w:after="40" w:line="252"/>
+            </w:pPr>
+            <w:r>
+              <w:rPr>
+                <w:sz w:val="20"/>
+                <w:szCs w:val="20"/>
+              </w:rPr>
+              <w:t xml:space="preserve"/>
+            </w:r>
+          </w:p>
+        </w:tc>
+        <w:tc>
+          <w:tcPr>
+            <w:tcW w:type="dxa" w:w="1500"/>
+            <w:tcBorders>
+              <w:top w:val="single" w:color="BFBFBF" w:sz="4"/>
+              <w:left w:val="single" w:color="BFBFBF" w:sz="4"/>
+              <w:bottom w:val="single" w:color="BFBFBF" w:sz="4"/>
+              <w:right w:val="single" w:color="BFBFBF" w:sz="4"/>
+            </w:tcBorders>
+            <w:shd w:fill="FFF7D6" w:color="auto" w:val="clear"/>
+            <w:tcMar>
+              <w:top w:type="dxa" w:w="70"/>
+              <w:left w:type="dxa" w:w="110"/>
+              <w:bottom w:type="dxa" w:w="70"/>
+              <w:right w:type="dxa" w:w="110"/>
+            </w:tcMar>
+            <w:vAlign w:val="top"/>
+          </w:tcPr>
+          <w:p>
+            <w:pPr>
+              <w:spacing w:after="40" w:line="252"/>
+            </w:pPr>
+            <w:r>
+              <w:rPr>
+                <w:sz w:val="20"/>
+                <w:szCs w:val="20"/>
+              </w:rPr>
+              <w:t xml:space="preserve"/>
+            </w:r>
+          </w:p>
+        </w:tc>
+      </w:tr>
+      <w:tr>
+        <w:trPr>
+          <w:cantSplit/>
+        </w:trPr>
+        <w:tc>
+          <w:tcPr>
+            <w:tcW w:type="dxa" w:w="1750"/>
+            <w:tcBorders>
+              <w:top w:val="single" w:color="BFBFBF" w:sz="4"/>
+              <w:left w:val="single" w:color="BFBFBF" w:sz="4"/>
+              <w:bottom w:val="single" w:color="BFBFBF" w:sz="4"/>
+              <w:right w:val="single" w:color="BFBFBF" w:sz="4"/>
+            </w:tcBorders>
+            <w:tcMar>
+              <w:top w:type="dxa" w:w="70"/>
+              <w:left w:type="dxa" w:w="110"/>
+              <w:bottom w:type="dxa" w:w="70"/>
+              <w:right w:type="dxa" w:w="110"/>
+            </w:tcMar>
+            <w:vAlign w:val="top"/>
+          </w:tcPr>
+          <w:p>
+            <w:pPr>
+              <w:spacing w:after="40" w:line="252"/>
+            </w:pPr>
+            <w:r>
+              <w:rPr>
+                <w:b/>
+                <w:bCs/>
+                <w:sz w:val="20"/>
+                <w:szCs w:val="20"/>
+              </w:rPr>
+              <w:t xml:space="preserve">Chaat-GPT</w:t>
+            </w:r>
+          </w:p>
+        </w:tc>
+        <w:tc>
+          <w:tcPr>
+            <w:tcW w:type="dxa" w:w="1300"/>
+            <w:tcBorders>
+              <w:top w:val="single" w:color="BFBFBF" w:sz="4"/>
+              <w:left w:val="single" w:color="BFBFBF" w:sz="4"/>
+              <w:bottom w:val="single" w:color="BFBFBF" w:sz="4"/>
+              <w:right w:val="single" w:color="BFBFBF" w:sz="4"/>
+            </w:tcBorders>
+            <w:tcMar>
+              <w:top w:type="dxa" w:w="70"/>
+              <w:left w:type="dxa" w:w="110"/>
+              <w:bottom w:type="dxa" w:w="70"/>
+              <w:right w:type="dxa" w:w="110"/>
+            </w:tcMar>
+            <w:vAlign w:val="top"/>
+          </w:tcPr>
+          <w:p>
+            <w:pPr>
+              <w:spacing w:after="40" w:line="252"/>
+            </w:pPr>
+            <w:r>
+              <w:rPr>
+                <w:sz w:val="20"/>
+                <w:szCs w:val="20"/>
+              </w:rPr>
+              <w:t xml:space="preserve">None this month</w:t>
+            </w:r>
+          </w:p>
+        </w:tc>
+        <w:tc>
+          <w:tcPr>
+            <w:tcW w:type="dxa" w:w="1600"/>
+            <w:tcBorders>
+              <w:top w:val="single" w:color="BFBFBF" w:sz="4"/>
+              <w:left w:val="single" w:color="BFBFBF" w:sz="4"/>
+              <w:bottom w:val="single" w:color="BFBFBF" w:sz="4"/>
+              <w:right w:val="single" w:color="BFBFBF" w:sz="4"/>
+            </w:tcBorders>
+            <w:tcMar>
+              <w:top w:type="dxa" w:w="70"/>
+              <w:left w:type="dxa" w:w="110"/>
+              <w:bottom w:type="dxa" w:w="70"/>
+              <w:right w:type="dxa" w:w="110"/>
+            </w:tcMar>
+            <w:vAlign w:val="top"/>
+          </w:tcPr>
+          <w:p>
+            <w:pPr>
+              <w:spacing w:after="40" w:line="252"/>
+            </w:pPr>
+            <w:r>
+              <w:rPr>
+                <w:sz w:val="20"/>
+                <w:szCs w:val="20"/>
+              </w:rPr>
+              <w:t xml:space="preserve">Menu only (43 dishes), no sales</w:t>
+            </w:r>
+          </w:p>
+        </w:tc>
+        <w:tc>
+          <w:tcPr>
+            <w:tcW w:type="dxa" w:w="850"/>
+            <w:tcBorders>
+              <w:top w:val="single" w:color="BFBFBF" w:sz="4"/>
+              <w:left w:val="single" w:color="BFBFBF" w:sz="4"/>
+              <w:bottom w:val="single" w:color="BFBFBF" w:sz="4"/>
+              <w:right w:val="single" w:color="BFBFBF" w:sz="4"/>
+            </w:tcBorders>
+            <w:tcMar>
+              <w:top w:type="dxa" w:w="70"/>
+              <w:left w:type="dxa" w:w="110"/>
+              <w:bottom w:type="dxa" w:w="70"/>
+              <w:right w:type="dxa" w:w="110"/>
+            </w:tcMar>
+            <w:vAlign w:val="top"/>
+          </w:tcPr>
+          <w:p>
+            <w:pPr>
+              <w:spacing w:after="40" w:line="252"/>
+              <w:jc w:val="right"/>
+            </w:pPr>
+            <w:r>
+              <w:rPr>
+                <w:sz w:val="20"/>
+                <w:szCs w:val="20"/>
+              </w:rPr>
+              <w:t xml:space="preserve">0</w:t>
+            </w:r>
+          </w:p>
+        </w:tc>
+        <w:tc>
+          <w:tcPr>
+            <w:tcW w:type="dxa" w:w="800"/>
+            <w:tcBorders>
+              <w:top w:val="single" w:color="BFBFBF" w:sz="4"/>
+              <w:left w:val="single" w:color="BFBFBF" w:sz="4"/>
+              <w:bottom w:val="single" w:color="BFBFBF" w:sz="4"/>
+              <w:right w:val="single" w:color="BFBFBF" w:sz="4"/>
+            </w:tcBorders>
+            <w:tcMar>
+              <w:top w:type="dxa" w:w="70"/>
+              <w:left w:type="dxa" w:w="110"/>
+              <w:bottom w:type="dxa" w:w="70"/>
+              <w:right w:type="dxa" w:w="110"/>
+            </w:tcMar>
+            <w:vAlign w:val="top"/>
+          </w:tcPr>
+          <w:p>
+            <w:pPr>
+              <w:spacing w:after="40" w:line="252"/>
+              <w:jc w:val="right"/>
+            </w:pPr>
+            <w:r>
+              <w:rPr>
+                <w:sz w:val="20"/>
+                <w:szCs w:val="20"/>
+              </w:rPr>
+              <w:t xml:space="preserve">0%</w:t>
+            </w:r>
+          </w:p>
+        </w:tc>
+        <w:tc>
+          <w:tcPr>
+            <w:tcW w:type="dxa" w:w="1946"/>
+            <w:tcBorders>
+              <w:top w:val="single" w:color="BFBFBF" w:sz="4"/>
+              <w:left w:val="single" w:color="BFBFBF" w:sz="4"/>
+              <w:bottom w:val="single" w:color="BFBFBF" w:sz="4"/>
+              <w:right w:val="single" w:color="BFBFBF" w:sz="4"/>
+            </w:tcBorders>
+            <w:shd w:fill="FFF7D6" w:color="auto" w:val="clear"/>
+            <w:tcMar>
+              <w:top w:type="dxa" w:w="70"/>
+              <w:left w:type="dxa" w:w="110"/>
+              <w:bottom w:type="dxa" w:w="70"/>
+              <w:right w:type="dxa" w:w="110"/>
+            </w:tcMar>
+            <w:vAlign w:val="top"/>
+          </w:tcPr>
+          <w:p>
+            <w:pPr>
+              <w:spacing w:after="40" w:line="252"/>
+            </w:pPr>
+            <w:r>
+              <w:rPr>
+                <w:sz w:val="20"/>
+                <w:szCs w:val="20"/>
+              </w:rPr>
+              <w:t xml:space="preserve"/>
+            </w:r>
+          </w:p>
+        </w:tc>
+        <w:tc>
+          <w:tcPr>
+            <w:tcW w:type="dxa" w:w="1500"/>
+            <w:tcBorders>
+              <w:top w:val="single" w:color="BFBFBF" w:sz="4"/>
+              <w:left w:val="single" w:color="BFBFBF" w:sz="4"/>
+              <w:bottom w:val="single" w:color="BFBFBF" w:sz="4"/>
+              <w:right w:val="single" w:color="BFBFBF" w:sz="4"/>
+            </w:tcBorders>
+            <w:shd w:fill="FFF7D6" w:color="auto" w:val="clear"/>
+            <w:tcMar>
+              <w:top w:type="dxa" w:w="70"/>
+              <w:left w:type="dxa" w:w="110"/>
+              <w:bottom w:type="dxa" w:w="70"/>
+              <w:right w:type="dxa" w:w="110"/>
+            </w:tcMar>
+            <w:vAlign w:val="top"/>
+          </w:tcPr>
+          <w:p>
+            <w:pPr>
+              <w:spacing w:after="40" w:line="252"/>
+            </w:pPr>
+            <w:r>
+              <w:rPr>
+                <w:sz w:val="20"/>
+                <w:szCs w:val="20"/>
+              </w:rPr>
+              <w:t xml:space="preserve"/>
+            </w:r>
+          </w:p>
+        </w:tc>
+      </w:tr>
+      <w:tr>
+        <w:trPr>
+          <w:cantSplit/>
+        </w:trPr>
+        <w:tc>
+          <w:tcPr>
+            <w:tcW w:type="dxa" w:w="1750"/>
+            <w:tcBorders>
+              <w:top w:val="single" w:color="BFBFBF" w:sz="4"/>
+              <w:left w:val="single" w:color="BFBFBF" w:sz="4"/>
+              <w:bottom w:val="single" w:color="BFBFBF" w:sz="4"/>
+              <w:right w:val="single" w:color="BFBFBF" w:sz="4"/>
+            </w:tcBorders>
+            <w:tcMar>
+              <w:top w:type="dxa" w:w="70"/>
+              <w:left w:type="dxa" w:w="110"/>
+              <w:bottom w:type="dxa" w:w="70"/>
+              <w:right w:type="dxa" w:w="110"/>
+            </w:tcMar>
+            <w:vAlign w:val="top"/>
+          </w:tcPr>
+          <w:p>
+            <w:pPr>
+              <w:spacing w:after="40" w:line="252"/>
+            </w:pPr>
+            <w:r>
+              <w:rPr>
+                <w:b/>
+                <w:bCs/>
+                <w:sz w:val="20"/>
+                <w:szCs w:val="20"/>
+              </w:rPr>
+              <w:t xml:space="preserve">Saladeo</w:t>
+            </w:r>
+          </w:p>
+        </w:tc>
+        <w:tc>
+          <w:tcPr>
+            <w:tcW w:type="dxa" w:w="1300"/>
+            <w:tcBorders>
+              <w:top w:val="single" w:color="BFBFBF" w:sz="4"/>
+              <w:left w:val="single" w:color="BFBFBF" w:sz="4"/>
+              <w:bottom w:val="single" w:color="BFBFBF" w:sz="4"/>
+              <w:right w:val="single" w:color="BFBFBF" w:sz="4"/>
+            </w:tcBorders>
+            <w:tcMar>
+              <w:top w:type="dxa" w:w="70"/>
+              <w:left w:type="dxa" w:w="110"/>
+              <w:bottom w:type="dxa" w:w="70"/>
+              <w:right w:type="dxa" w:w="110"/>
+            </w:tcMar>
+            <w:vAlign w:val="top"/>
+          </w:tcPr>
+          <w:p>
+            <w:pPr>
+              <w:spacing w:after="40" w:line="252"/>
+            </w:pPr>
+            <w:r>
+              <w:rPr>
+                <w:sz w:val="20"/>
+                <w:szCs w:val="20"/>
+              </w:rPr>
+              <w:t xml:space="preserve">None this month</w:t>
+            </w:r>
+          </w:p>
+        </w:tc>
+        <w:tc>
+          <w:tcPr>
+            <w:tcW w:type="dxa" w:w="1600"/>
+            <w:tcBorders>
+              <w:top w:val="single" w:color="BFBFBF" w:sz="4"/>
+              <w:left w:val="single" w:color="BFBFBF" w:sz="4"/>
+              <w:bottom w:val="single" w:color="BFBFBF" w:sz="4"/>
+              <w:right w:val="single" w:color="BFBFBF" w:sz="4"/>
+            </w:tcBorders>
+            <w:tcMar>
+              <w:top w:type="dxa" w:w="70"/>
+              <w:left w:type="dxa" w:w="110"/>
+              <w:bottom w:type="dxa" w:w="70"/>
+              <w:right w:type="dxa" w:w="110"/>
+            </w:tcMar>
+            <w:vAlign w:val="top"/>
+          </w:tcPr>
+          <w:p>
+            <w:pPr>
+              <w:spacing w:after="40" w:line="252"/>
+            </w:pPr>
+            <w:r>
+              <w:rPr>
+                <w:sz w:val="20"/>
+                <w:szCs w:val="20"/>
+              </w:rPr>
+              <w:t xml:space="preserve">Menu only (11 dishes), no sales</w:t>
+            </w:r>
+          </w:p>
+        </w:tc>
+        <w:tc>
+          <w:tcPr>
+            <w:tcW w:type="dxa" w:w="850"/>
+            <w:tcBorders>
+              <w:top w:val="single" w:color="BFBFBF" w:sz="4"/>
+              <w:left w:val="single" w:color="BFBFBF" w:sz="4"/>
+              <w:bottom w:val="single" w:color="BFBFBF" w:sz="4"/>
+              <w:right w:val="single" w:color="BFBFBF" w:sz="4"/>
+            </w:tcBorders>
+            <w:tcMar>
+              <w:top w:type="dxa" w:w="70"/>
+              <w:left w:type="dxa" w:w="110"/>
+              <w:bottom w:type="dxa" w:w="70"/>
+              <w:right w:type="dxa" w:w="110"/>
+            </w:tcMar>
+            <w:vAlign w:val="top"/>
+          </w:tcPr>
+          <w:p>
+            <w:pPr>
+              <w:spacing w:after="40" w:line="252"/>
+              <w:jc w:val="right"/>
+            </w:pPr>
+            <w:r>
+              <w:rPr>
+                <w:sz w:val="20"/>
+                <w:szCs w:val="20"/>
+              </w:rPr>
+              <w:t xml:space="preserve">0</w:t>
+            </w:r>
+          </w:p>
+        </w:tc>
+        <w:tc>
+          <w:tcPr>
+            <w:tcW w:type="dxa" w:w="800"/>
+            <w:tcBorders>
+              <w:top w:val="single" w:color="BFBFBF" w:sz="4"/>
+              <w:left w:val="single" w:color="BFBFBF" w:sz="4"/>
+              <w:bottom w:val="single" w:color="BFBFBF" w:sz="4"/>
+              <w:right w:val="single" w:color="BFBFBF" w:sz="4"/>
+            </w:tcBorders>
+            <w:tcMar>
+              <w:top w:type="dxa" w:w="70"/>
+              <w:left w:type="dxa" w:w="110"/>
+              <w:bottom w:type="dxa" w:w="70"/>
+              <w:right w:type="dxa" w:w="110"/>
+            </w:tcMar>
+            <w:vAlign w:val="top"/>
+          </w:tcPr>
+          <w:p>
+            <w:pPr>
+              <w:spacing w:after="40" w:line="252"/>
+              <w:jc w:val="right"/>
+            </w:pPr>
+            <w:r>
+              <w:rPr>
+                <w:sz w:val="20"/>
+                <w:szCs w:val="20"/>
+              </w:rPr>
+              <w:t xml:space="preserve">0%</w:t>
+            </w:r>
+          </w:p>
+        </w:tc>
+        <w:tc>
+          <w:tcPr>
+            <w:tcW w:type="dxa" w:w="1946"/>
+            <w:tcBorders>
+              <w:top w:val="single" w:color="BFBFBF" w:sz="4"/>
+              <w:left w:val="single" w:color="BFBFBF" w:sz="4"/>
+              <w:bottom w:val="single" w:color="BFBFBF" w:sz="4"/>
+              <w:right w:val="single" w:color="BFBFBF" w:sz="4"/>
+            </w:tcBorders>
+            <w:shd w:fill="FFF7D6" w:color="auto" w:val="clear"/>
+            <w:tcMar>
+              <w:top w:type="dxa" w:w="70"/>
+              <w:left w:type="dxa" w:w="110"/>
+              <w:bottom w:type="dxa" w:w="70"/>
+              <w:right w:type="dxa" w:w="110"/>
+            </w:tcMar>
+            <w:vAlign w:val="top"/>
+          </w:tcPr>
+          <w:p>
+            <w:pPr>
+              <w:spacing w:after="40" w:line="252"/>
+            </w:pPr>
+            <w:r>
+              <w:rPr>
+                <w:sz w:val="20"/>
+                <w:szCs w:val="20"/>
+              </w:rPr>
+              <w:t xml:space="preserve"/>
+            </w:r>
+          </w:p>
+        </w:tc>
+        <w:tc>
+          <w:tcPr>
+            <w:tcW w:type="dxa" w:w="1500"/>
+            <w:tcBorders>
+              <w:top w:val="single" w:color="BFBFBF" w:sz="4"/>
+              <w:left w:val="single" w:color="BFBFBF" w:sz="4"/>
+              <w:bottom w:val="single" w:color="BFBFBF" w:sz="4"/>
+              <w:right w:val="single" w:color="BFBFBF" w:sz="4"/>
+            </w:tcBorders>
+            <w:shd w:fill="FFF7D6" w:color="auto" w:val="clear"/>
+            <w:tcMar>
+              <w:top w:type="dxa" w:w="70"/>
+              <w:left w:type="dxa" w:w="110"/>
+              <w:bottom w:type="dxa" w:w="70"/>
+              <w:right w:type="dxa" w:w="110"/>
+            </w:tcMar>
+            <w:vAlign w:val="top"/>
+          </w:tcPr>
+          <w:p>
+            <w:pPr>
+              <w:spacing w:after="40" w:line="252"/>
+            </w:pPr>
+            <w:r>
+              <w:rPr>
+                <w:sz w:val="20"/>
+                <w:szCs w:val="20"/>
+              </w:rPr>
+              <w:t xml:space="preserve"/>
+            </w:r>
+          </w:p>
+        </w:tc>
+      </w:tr>
+      <w:tr>
+        <w:trPr>
+          <w:cantSplit/>
+        </w:trPr>
+        <w:tc>
+          <w:tcPr>
+            <w:tcW w:type="dxa" w:w="1750"/>
+            <w:tcBorders>
+              <w:top w:val="single" w:color="BFBFBF" w:sz="4"/>
+              <w:left w:val="single" w:color="BFBFBF" w:sz="4"/>
+              <w:bottom w:val="single" w:color="BFBFBF" w:sz="4"/>
+              <w:right w:val="single" w:color="BFBFBF" w:sz="4"/>
+            </w:tcBorders>
+            <w:tcMar>
+              <w:top w:type="dxa" w:w="70"/>
+              <w:left w:type="dxa" w:w="110"/>
+              <w:bottom w:type="dxa" w:w="70"/>
+              <w:right w:type="dxa" w:w="110"/>
+            </w:tcMar>
+            <w:vAlign w:val="top"/>
+          </w:tcPr>
+          <w:p>
+            <w:pPr>
+              <w:spacing w:after="40" w:line="252"/>
+            </w:pPr>
+            <w:r>
+              <w:rPr>
+                <w:b/>
+                <w:bCs/>
+                <w:sz w:val="20"/>
+                <w:szCs w:val="20"/>
+              </w:rPr>
+              <w:t xml:space="preserve">The Big Biryani Theory</w:t>
+            </w:r>
+          </w:p>
+        </w:tc>
+        <w:tc>
+          <w:tcPr>
+            <w:tcW w:type="dxa" w:w="1300"/>
+            <w:tcBorders>
+              <w:top w:val="single" w:color="BFBFBF" w:sz="4"/>
+              <w:left w:val="single" w:color="BFBFBF" w:sz="4"/>
+              <w:bottom w:val="single" w:color="BFBFBF" w:sz="4"/>
+              <w:right w:val="single" w:color="BFBFBF" w:sz="4"/>
+            </w:tcBorders>
+            <w:tcMar>
+              <w:top w:type="dxa" w:w="70"/>
+              <w:left w:type="dxa" w:w="110"/>
+              <w:bottom w:type="dxa" w:w="70"/>
+              <w:right w:type="dxa" w:w="110"/>
+            </w:tcMar>
+            <w:vAlign w:val="top"/>
+          </w:tcPr>
+          <w:p>
+            <w:pPr>
+              <w:spacing w:after="40" w:line="252"/>
+            </w:pPr>
+            <w:r>
+              <w:rPr>
+                <w:sz w:val="20"/>
+                <w:szCs w:val="20"/>
+              </w:rPr>
+              <w:t xml:space="preserve">None this month</w:t>
+            </w:r>
+          </w:p>
+        </w:tc>
+        <w:tc>
+          <w:tcPr>
+            <w:tcW w:type="dxa" w:w="1600"/>
+            <w:tcBorders>
+              <w:top w:val="single" w:color="BFBFBF" w:sz="4"/>
+              <w:left w:val="single" w:color="BFBFBF" w:sz="4"/>
+              <w:bottom w:val="single" w:color="BFBFBF" w:sz="4"/>
+              <w:right w:val="single" w:color="BFBFBF" w:sz="4"/>
+            </w:tcBorders>
+            <w:tcMar>
+              <w:top w:type="dxa" w:w="70"/>
+              <w:left w:type="dxa" w:w="110"/>
+              <w:bottom w:type="dxa" w:w="70"/>
+              <w:right w:type="dxa" w:w="110"/>
+            </w:tcMar>
+            <w:vAlign w:val="top"/>
+          </w:tcPr>
+          <w:p>
+            <w:pPr>
+              <w:spacing w:after="40" w:line="252"/>
+            </w:pPr>
+            <w:r>
+              <w:rPr>
+                <w:sz w:val="20"/>
+                <w:szCs w:val="20"/>
+              </w:rPr>
+              <w:t xml:space="preserve">Menu only (10 dishes), no sales</w:t>
+            </w:r>
+          </w:p>
+        </w:tc>
+        <w:tc>
+          <w:tcPr>
+            <w:tcW w:type="dxa" w:w="850"/>
+            <w:tcBorders>
+              <w:top w:val="single" w:color="BFBFBF" w:sz="4"/>
+              <w:left w:val="single" w:color="BFBFBF" w:sz="4"/>
+              <w:bottom w:val="single" w:color="BFBFBF" w:sz="4"/>
+              <w:right w:val="single" w:color="BFBFBF" w:sz="4"/>
+            </w:tcBorders>
+            <w:tcMar>
+              <w:top w:type="dxa" w:w="70"/>
+              <w:left w:type="dxa" w:w="110"/>
+              <w:bottom w:type="dxa" w:w="70"/>
+              <w:right w:type="dxa" w:w="110"/>
+            </w:tcMar>
+            <w:vAlign w:val="top"/>
+          </w:tcPr>
+          <w:p>
+            <w:pPr>
+              <w:spacing w:after="40" w:line="252"/>
+              <w:jc w:val="right"/>
+            </w:pPr>
+            <w:r>
+              <w:rPr>
+                <w:sz w:val="20"/>
+                <w:szCs w:val="20"/>
+              </w:rPr>
+              <w:t xml:space="preserve">0</w:t>
+            </w:r>
+          </w:p>
+        </w:tc>
+        <w:tc>
+          <w:tcPr>
+            <w:tcW w:type="dxa" w:w="800"/>
+            <w:tcBorders>
+              <w:top w:val="single" w:color="BFBFBF" w:sz="4"/>
+              <w:left w:val="single" w:color="BFBFBF" w:sz="4"/>
+              <w:bottom w:val="single" w:color="BFBFBF" w:sz="4"/>
+              <w:right w:val="single" w:color="BFBFBF" w:sz="4"/>
+            </w:tcBorders>
+            <w:tcMar>
+              <w:top w:type="dxa" w:w="70"/>
+              <w:left w:type="dxa" w:w="110"/>
+              <w:bottom w:type="dxa" w:w="70"/>
+              <w:right w:type="dxa" w:w="110"/>
+            </w:tcMar>
+            <w:vAlign w:val="top"/>
+          </w:tcPr>
+          <w:p>
+            <w:pPr>
+              <w:spacing w:after="40" w:line="252"/>
+              <w:jc w:val="right"/>
+            </w:pPr>
+            <w:r>
+              <w:rPr>
+                <w:sz w:val="20"/>
+                <w:szCs w:val="20"/>
+              </w:rPr>
+              <w:t xml:space="preserve">0%</w:t>
+            </w:r>
+          </w:p>
+        </w:tc>
+        <w:tc>
+          <w:tcPr>
+            <w:tcW w:type="dxa" w:w="1946"/>
+            <w:tcBorders>
+              <w:top w:val="single" w:color="BFBFBF" w:sz="4"/>
+              <w:left w:val="single" w:color="BFBFBF" w:sz="4"/>
+              <w:bottom w:val="single" w:color="BFBFBF" w:sz="4"/>
+              <w:right w:val="single" w:color="BFBFBF" w:sz="4"/>
+            </w:tcBorders>
+            <w:shd w:fill="FFF7D6" w:color="auto" w:val="clear"/>
+            <w:tcMar>
+              <w:top w:type="dxa" w:w="70"/>
+              <w:left w:type="dxa" w:w="110"/>
+              <w:bottom w:type="dxa" w:w="70"/>
+              <w:right w:type="dxa" w:w="110"/>
+            </w:tcMar>
+            <w:vAlign w:val="top"/>
+          </w:tcPr>
+          <w:p>
+            <w:pPr>
+              <w:spacing w:after="40" w:line="252"/>
+            </w:pPr>
+            <w:r>
+              <w:rPr>
+                <w:sz w:val="20"/>
+                <w:szCs w:val="20"/>
+              </w:rPr>
+              <w:t xml:space="preserve"/>
+            </w:r>
+          </w:p>
+        </w:tc>
+        <w:tc>
+          <w:tcPr>
+            <w:tcW w:type="dxa" w:w="1500"/>
+            <w:tcBorders>
+              <w:top w:val="single" w:color="BFBFBF" w:sz="4"/>
+              <w:left w:val="single" w:color="BFBFBF" w:sz="4"/>
+              <w:bottom w:val="single" w:color="BFBFBF" w:sz="4"/>
+              <w:right w:val="single" w:color="BFBFBF" w:sz="4"/>
+            </w:tcBorders>
+            <w:shd w:fill="FFF7D6" w:color="auto" w:val="clear"/>
+            <w:tcMar>
+              <w:top w:type="dxa" w:w="70"/>
+              <w:left w:type="dxa" w:w="110"/>
+              <w:bottom w:type="dxa" w:w="70"/>
+              <w:right w:type="dxa" w:w="110"/>
+            </w:tcMar>
+            <w:vAlign w:val="top"/>
+          </w:tcPr>
+          <w:p>
+            <w:pPr>
+              <w:spacing w:after="40" w:line="252"/>
+            </w:pPr>
+            <w:r>
+              <w:rPr>
+                <w:sz w:val="20"/>
+                <w:szCs w:val="20"/>
+              </w:rPr>
+              <w:t xml:space="preserve"/>
+            </w:r>
+          </w:p>
+        </w:tc>
+      </w:tr>
+      <w:tr>
+        <w:trPr>
+          <w:cantSplit/>
+        </w:trPr>
+        <w:tc>
+          <w:tcPr>
+            <w:tcW w:type="dxa" w:w="1750"/>
+            <w:tcBorders>
+              <w:top w:val="single" w:color="BFBFBF" w:sz="4"/>
+              <w:left w:val="single" w:color="BFBFBF" w:sz="4"/>
+              <w:bottom w:val="single" w:color="BFBFBF" w:sz="4"/>
+              <w:right w:val="single" w:color="BFBFBF" w:sz="4"/>
+            </w:tcBorders>
+            <w:tcMar>
+              <w:top w:type="dxa" w:w="70"/>
+              <w:left w:type="dxa" w:w="110"/>
+              <w:bottom w:type="dxa" w:w="70"/>
+              <w:right w:type="dxa" w:w="110"/>
+            </w:tcMar>
+            <w:vAlign w:val="top"/>
+          </w:tcPr>
+          <w:p>
+            <w:pPr>
+              <w:spacing w:after="40" w:line="252"/>
+            </w:pPr>
+            <w:r>
+              <w:rPr>
+                <w:b/>
+                <w:bCs/>
+                <w:sz w:val="20"/>
+                <w:szCs w:val="20"/>
+              </w:rPr>
+              <w:t xml:space="preserve">Pynch</w:t>
+            </w:r>
+          </w:p>
+        </w:tc>
+        <w:tc>
+          <w:tcPr>
+            <w:tcW w:type="dxa" w:w="1300"/>
+            <w:tcBorders>
+              <w:top w:val="single" w:color="BFBFBF" w:sz="4"/>
+              <w:left w:val="single" w:color="BFBFBF" w:sz="4"/>
+              <w:bottom w:val="single" w:color="BFBFBF" w:sz="4"/>
+              <w:right w:val="single" w:color="BFBFBF" w:sz="4"/>
+            </w:tcBorders>
+            <w:tcMar>
+              <w:top w:type="dxa" w:w="70"/>
+              <w:left w:type="dxa" w:w="110"/>
+              <w:bottom w:type="dxa" w:w="70"/>
+              <w:right w:type="dxa" w:w="110"/>
+            </w:tcMar>
+            <w:vAlign w:val="top"/>
+          </w:tcPr>
+          <w:p>
+            <w:pPr>
+              <w:spacing w:after="40" w:line="252"/>
+            </w:pPr>
+            <w:r>
+              <w:rPr>
+                <w:sz w:val="20"/>
+                <w:szCs w:val="20"/>
+              </w:rPr>
+              <w:t xml:space="preserve">None this month</w:t>
+            </w:r>
+          </w:p>
+        </w:tc>
+        <w:tc>
+          <w:tcPr>
+            <w:tcW w:type="dxa" w:w="1600"/>
+            <w:tcBorders>
+              <w:top w:val="single" w:color="BFBFBF" w:sz="4"/>
+              <w:left w:val="single" w:color="BFBFBF" w:sz="4"/>
+              <w:bottom w:val="single" w:color="BFBFBF" w:sz="4"/>
+              <w:right w:val="single" w:color="BFBFBF" w:sz="4"/>
+            </w:tcBorders>
+            <w:tcMar>
+              <w:top w:type="dxa" w:w="70"/>
+              <w:left w:type="dxa" w:w="110"/>
+              <w:bottom w:type="dxa" w:w="70"/>
+              <w:right w:type="dxa" w:w="110"/>
+            </w:tcMar>
+            <w:vAlign w:val="top"/>
+          </w:tcPr>
+          <w:p>
+            <w:pPr>
+              <w:spacing w:after="40" w:line="252"/>
+            </w:pPr>
+            <w:r>
+              <w:rPr>
+                <w:sz w:val="20"/>
+                <w:szCs w:val="20"/>
+              </w:rPr>
+              <w:t xml:space="preserve">Menu only (8 dishes), no sales</w:t>
+            </w:r>
+          </w:p>
+        </w:tc>
+        <w:tc>
+          <w:tcPr>
+            <w:tcW w:type="dxa" w:w="850"/>
+            <w:tcBorders>
+              <w:top w:val="single" w:color="BFBFBF" w:sz="4"/>
+              <w:left w:val="single" w:color="BFBFBF" w:sz="4"/>
+              <w:bottom w:val="single" w:color="BFBFBF" w:sz="4"/>
+              <w:right w:val="single" w:color="BFBFBF" w:sz="4"/>
+            </w:tcBorders>
+            <w:tcMar>
+              <w:top w:type="dxa" w:w="70"/>
+              <w:left w:type="dxa" w:w="110"/>
+              <w:bottom w:type="dxa" w:w="70"/>
+              <w:right w:type="dxa" w:w="110"/>
+            </w:tcMar>
+            <w:vAlign w:val="top"/>
+          </w:tcPr>
+          <w:p>
+            <w:pPr>
+              <w:spacing w:after="40" w:line="252"/>
+              <w:jc w:val="right"/>
+            </w:pPr>
+            <w:r>
+              <w:rPr>
+                <w:sz w:val="20"/>
+                <w:szCs w:val="20"/>
+              </w:rPr>
+              <w:t xml:space="preserve">0</w:t>
+            </w:r>
+          </w:p>
+        </w:tc>
+        <w:tc>
+          <w:tcPr>
+            <w:tcW w:type="dxa" w:w="800"/>
+            <w:tcBorders>
+              <w:top w:val="single" w:color="BFBFBF" w:sz="4"/>
+              <w:left w:val="single" w:color="BFBFBF" w:sz="4"/>
+              <w:bottom w:val="single" w:color="BFBFBF" w:sz="4"/>
+              <w:right w:val="single" w:color="BFBFBF" w:sz="4"/>
+            </w:tcBorders>
+            <w:tcMar>
+              <w:top w:type="dxa" w:w="70"/>
+              <w:left w:type="dxa" w:w="110"/>
+              <w:bottom w:type="dxa" w:w="70"/>
+              <w:right w:type="dxa" w:w="110"/>
+            </w:tcMar>
+            <w:vAlign w:val="top"/>
+          </w:tcPr>
+          <w:p>
+            <w:pPr>
+              <w:spacing w:after="40" w:line="252"/>
+              <w:jc w:val="right"/>
+            </w:pPr>
+            <w:r>
+              <w:rPr>
+                <w:sz w:val="20"/>
+                <w:szCs w:val="20"/>
+              </w:rPr>
+              <w:t xml:space="preserve">0%</w:t>
+            </w:r>
+          </w:p>
+        </w:tc>
+        <w:tc>
+          <w:tcPr>
+            <w:tcW w:type="dxa" w:w="1946"/>
+            <w:tcBorders>
+              <w:top w:val="single" w:color="BFBFBF" w:sz="4"/>
+              <w:left w:val="single" w:color="BFBFBF" w:sz="4"/>
+              <w:bottom w:val="single" w:color="BFBFBF" w:sz="4"/>
+              <w:right w:val="single" w:color="BFBFBF" w:sz="4"/>
+            </w:tcBorders>
+            <w:shd w:fill="FFF7D6" w:color="auto" w:val="clear"/>
+            <w:tcMar>
+              <w:top w:type="dxa" w:w="70"/>
+              <w:left w:type="dxa" w:w="110"/>
+              <w:bottom w:type="dxa" w:w="70"/>
+              <w:right w:type="dxa" w:w="110"/>
+            </w:tcMar>
+            <w:vAlign w:val="top"/>
+          </w:tcPr>
+          <w:p>
+            <w:pPr>
+              <w:spacing w:after="40" w:line="252"/>
+            </w:pPr>
+            <w:r>
+              <w:rPr>
+                <w:sz w:val="20"/>
+                <w:szCs w:val="20"/>
+              </w:rPr>
+              <w:t xml:space="preserve"/>
+            </w:r>
+          </w:p>
+        </w:tc>
+        <w:tc>
+          <w:tcPr>
+            <w:tcW w:type="dxa" w:w="1500"/>
+            <w:tcBorders>
+              <w:top w:val="single" w:color="BFBFBF" w:sz="4"/>
+              <w:left w:val="single" w:color="BFBFBF" w:sz="4"/>
+              <w:bottom w:val="single" w:color="BFBFBF" w:sz="4"/>
+              <w:right w:val="single" w:color="BFBFBF" w:sz="4"/>
+            </w:tcBorders>
+            <w:shd w:fill="FFF7D6" w:color="auto" w:val="clear"/>
+            <w:tcMar>
+              <w:top w:type="dxa" w:w="70"/>
+              <w:left w:type="dxa" w:w="110"/>
+              <w:bottom w:type="dxa" w:w="70"/>
+              <w:right w:type="dxa" w:w="110"/>
+            </w:tcMar>
+            <w:vAlign w:val="top"/>
+          </w:tcPr>
+          <w:p>
+            <w:pPr>
+              <w:spacing w:after="40" w:line="252"/>
+            </w:pPr>
+            <w:r>
+              <w:rPr>
+                <w:sz w:val="20"/>
+                <w:szCs w:val="20"/>
+              </w:rPr>
+              <w:t xml:space="preserve"/>
+            </w:r>
+          </w:p>
+        </w:tc>
+      </w:tr>
+      <w:tr>
+        <w:trPr>
+          <w:cantSplit/>
+        </w:trPr>
+        <w:tc>
+          <w:tcPr>
+            <w:tcW w:type="dxa" w:w="1750"/>
+            <w:tcBorders>
+              <w:top w:val="single" w:color="BFBFBF" w:sz="4"/>
+              <w:left w:val="single" w:color="BFBFBF" w:sz="4"/>
+              <w:bottom w:val="single" w:color="BFBFBF" w:sz="4"/>
+              <w:right w:val="single" w:color="BFBFBF" w:sz="4"/>
+            </w:tcBorders>
+            <w:tcMar>
+              <w:top w:type="dxa" w:w="70"/>
+              <w:left w:type="dxa" w:w="110"/>
+              <w:bottom w:type="dxa" w:w="70"/>
+              <w:right w:type="dxa" w:w="110"/>
+            </w:tcMar>
+            <w:vAlign w:val="top"/>
+          </w:tcPr>
+          <w:p>
+            <w:pPr>
+              <w:spacing w:after="40" w:line="252"/>
+            </w:pPr>
+            <w:r>
+              <w:rPr>
+                <w:b/>
+                <w:bCs/>
+                <w:sz w:val="20"/>
+                <w:szCs w:val="20"/>
+              </w:rPr>
+              <w:t xml:space="preserve">Swanky Spoon Society</w:t>
+            </w:r>
+          </w:p>
+        </w:tc>
+        <w:tc>
+          <w:tcPr>
+            <w:tcW w:type="dxa" w:w="1300"/>
+            <w:tcBorders>
+              <w:top w:val="single" w:color="BFBFBF" w:sz="4"/>
+              <w:left w:val="single" w:color="BFBFBF" w:sz="4"/>
+              <w:bottom w:val="single" w:color="BFBFBF" w:sz="4"/>
+              <w:right w:val="single" w:color="BFBFBF" w:sz="4"/>
+            </w:tcBorders>
+            <w:tcMar>
+              <w:top w:type="dxa" w:w="70"/>
+              <w:left w:type="dxa" w:w="110"/>
+              <w:bottom w:type="dxa" w:w="70"/>
+              <w:right w:type="dxa" w:w="110"/>
+            </w:tcMar>
+            <w:vAlign w:val="top"/>
+          </w:tcPr>
+          <w:p>
+            <w:pPr>
+              <w:spacing w:after="40" w:line="252"/>
+            </w:pPr>
+            <w:r>
+              <w:rPr>
+                <w:sz w:val="20"/>
+                <w:szCs w:val="20"/>
+              </w:rPr>
+              <w:t xml:space="preserve">None this month</w:t>
+            </w:r>
+          </w:p>
+        </w:tc>
+        <w:tc>
+          <w:tcPr>
+            <w:tcW w:type="dxa" w:w="1600"/>
+            <w:tcBorders>
+              <w:top w:val="single" w:color="BFBFBF" w:sz="4"/>
+              <w:left w:val="single" w:color="BFBFBF" w:sz="4"/>
+              <w:bottom w:val="single" w:color="BFBFBF" w:sz="4"/>
+              <w:right w:val="single" w:color="BFBFBF" w:sz="4"/>
+            </w:tcBorders>
+            <w:tcMar>
+              <w:top w:type="dxa" w:w="70"/>
+              <w:left w:type="dxa" w:w="110"/>
+              <w:bottom w:type="dxa" w:w="70"/>
+              <w:right w:type="dxa" w:w="110"/>
+            </w:tcMar>
+            <w:vAlign w:val="top"/>
+          </w:tcPr>
+          <w:p>
+            <w:pPr>
+              <w:spacing w:after="40" w:line="252"/>
+            </w:pPr>
+            <w:r>
+              <w:rPr>
+                <w:sz w:val="20"/>
+                <w:szCs w:val="20"/>
+              </w:rPr>
+              <w:t xml:space="preserve">Menu only (5 dishes), no sales</w:t>
+            </w:r>
+          </w:p>
+        </w:tc>
+        <w:tc>
+          <w:tcPr>
+            <w:tcW w:type="dxa" w:w="850"/>
+            <w:tcBorders>
+              <w:top w:val="single" w:color="BFBFBF" w:sz="4"/>
+              <w:left w:val="single" w:color="BFBFBF" w:sz="4"/>
+              <w:bottom w:val="single" w:color="BFBFBF" w:sz="4"/>
+              <w:right w:val="single" w:color="BFBFBF" w:sz="4"/>
+            </w:tcBorders>
+            <w:tcMar>
+              <w:top w:type="dxa" w:w="70"/>
+              <w:left w:type="dxa" w:w="110"/>
+              <w:bottom w:type="dxa" w:w="70"/>
+              <w:right w:type="dxa" w:w="110"/>
+            </w:tcMar>
+            <w:vAlign w:val="top"/>
+          </w:tcPr>
+          <w:p>
+            <w:pPr>
+              <w:spacing w:after="40" w:line="252"/>
+              <w:jc w:val="right"/>
+            </w:pPr>
+            <w:r>
+              <w:rPr>
+                <w:sz w:val="20"/>
+                <w:szCs w:val="20"/>
+              </w:rPr>
+              <w:t xml:space="preserve">0</w:t>
+            </w:r>
+          </w:p>
+        </w:tc>
+        <w:tc>
+          <w:tcPr>
+            <w:tcW w:type="dxa" w:w="800"/>
+            <w:tcBorders>
+              <w:top w:val="single" w:color="BFBFBF" w:sz="4"/>
+              <w:left w:val="single" w:color="BFBFBF" w:sz="4"/>
+              <w:bottom w:val="single" w:color="BFBFBF" w:sz="4"/>
+              <w:right w:val="single" w:color="BFBFBF" w:sz="4"/>
+            </w:tcBorders>
+            <w:tcMar>
+              <w:top w:type="dxa" w:w="70"/>
+              <w:left w:type="dxa" w:w="110"/>
+              <w:bottom w:type="dxa" w:w="70"/>
+              <w:right w:type="dxa" w:w="110"/>
+            </w:tcMar>
+            <w:vAlign w:val="top"/>
+          </w:tcPr>
+          <w:p>
+            <w:pPr>
+              <w:spacing w:after="40" w:line="252"/>
+              <w:jc w:val="right"/>
+            </w:pPr>
+            <w:r>
+              <w:rPr>
+                <w:sz w:val="20"/>
+                <w:szCs w:val="20"/>
+              </w:rPr>
+              <w:t xml:space="preserve">0%</w:t>
             </w:r>
           </w:p>
         </w:tc>
@@ -31281,7 +33330,7 @@
         <w:spacing w:after="60"/>
       </w:pPr>
       <w:r>
-        <w:t xml:space="preserve">Sales reports limited to the person's own brand, with date range and branch selection, first from Rista files you download (like the one from 19 October), then automatically once the API is available.</w:t>
+        <w:t xml:space="preserve">Sales reports limited to the person's own brand, with date range and branch selection, first from a monthly Rista download covering all branches, then automatically once the API is available. Cancelled orders shown separately.</w:t>
       </w:r>
     </w:p>
     <w:p>

</xml_diff>

<commit_message>
Docs: new features go into this app; Q1 becomes a non-blocking question
Co-Authored-By: Claude Opus 5.5 <noreply@anthropic.com>
</commit_message>
<xml_diff>
--- a/docs/Skope-Next-Phase-Questions-v2.docx
+++ b/docs/Skope-Next-Phase-Questions-v2.docx
@@ -3647,7 +3647,7 @@
                 <w:sz w:val="20"/>
                 <w:szCs w:val="20"/>
               </w:rPr>
-              <w:t xml:space="preserve">Working on the live DotPe account</w:t>
+              <w:t xml:space="preserve">Where the new features are built</w:t>
             </w:r>
           </w:p>
         </w:tc>
@@ -3677,7 +3677,7 @@
                 <w:sz w:val="20"/>
                 <w:szCs w:val="20"/>
               </w:rPr>
-              <w:t xml:space="preserve">There is no test account, so we start by only reading from Rista (orders, sales, menu). We change the menu only on dishes or a branch you choose for testing, at times you agree. Every change we send is recorded together with the old value, so it can be undone.</w:t>
+              <w:t xml:space="preserve">In this app, the Skope Operations Platform (test copy: skope-operations-platform.onrender.com), on top of what already works.</w:t>
             </w:r>
           </w:p>
         </w:tc>
@@ -3775,7 +3775,7 @@
                 <w:sz w:val="20"/>
                 <w:szCs w:val="20"/>
               </w:rPr>
-              <w:t xml:space="preserve">How fresh live orders are</w:t>
+              <w:t xml:space="preserve">Working on the live DotPe account</w:t>
             </w:r>
           </w:p>
         </w:tc>
@@ -3805,7 +3805,7 @@
                 <w:sz w:val="20"/>
                 <w:szCs w:val="20"/>
               </w:rPr>
-              <w:t xml:space="preserve">As live as DotPe allows: instantly if Rista can notify us, otherwise checked every minute.</w:t>
+              <w:t xml:space="preserve">There is no test account, so we start by only reading from Rista (orders, sales, menu). We change the menu only on dishes or a branch you choose for testing, at times you agree. Every change we send is recorded together with the old value, so it can be undone.</w:t>
             </w:r>
           </w:p>
         </w:tc>
@@ -3903,7 +3903,7 @@
                 <w:sz w:val="20"/>
                 <w:szCs w:val="20"/>
               </w:rPr>
-              <w:t xml:space="preserve">Order steps shown</w:t>
+              <w:t xml:space="preserve">How fresh live orders are</w:t>
             </w:r>
           </w:p>
         </w:tc>
@@ -3933,7 +3933,7 @@
                 <w:sz w:val="20"/>
                 <w:szCs w:val="20"/>
               </w:rPr>
-              <w:t xml:space="preserve">The same steps as Rista's order board: New, Accepted / Preparing, Prepared, Dispatched, Delivered, Cancelled.</w:t>
+              <w:t xml:space="preserve">As live as DotPe allows: instantly if Rista can notify us, otherwise checked every minute.</w:t>
             </w:r>
           </w:p>
         </w:tc>
@@ -4031,7 +4031,7 @@
                 <w:sz w:val="20"/>
                 <w:szCs w:val="20"/>
               </w:rPr>
-              <w:t xml:space="preserve">Order history</w:t>
+              <w:t xml:space="preserve">Order steps shown</w:t>
             </w:r>
           </w:p>
         </w:tc>
@@ -4061,7 +4061,7 @@
                 <w:sz w:val="20"/>
                 <w:szCs w:val="20"/>
               </w:rPr>
-              <w:t xml:space="preserve">The last 30 days are shown by default. Older orders can be found by choosing dates.</w:t>
+              <w:t xml:space="preserve">The same steps as Rista's order board: New, Accepted / Preparing, Prepared, Dispatched, Delivered, Cancelled.</w:t>
             </w:r>
           </w:p>
         </w:tc>
@@ -4159,7 +4159,7 @@
                 <w:sz w:val="20"/>
                 <w:szCs w:val="20"/>
               </w:rPr>
-              <w:t xml:space="preserve">Business day</w:t>
+              <w:t xml:space="preserve">Order history</w:t>
             </w:r>
           </w:p>
         </w:tc>
@@ -4189,7 +4189,7 @@
                 <w:sz w:val="20"/>
                 <w:szCs w:val="20"/>
               </w:rPr>
-              <w:t xml:space="preserve">Every sale is counted on Rista's own "Business Date", so our reports always match Rista.</w:t>
+              <w:t xml:space="preserve">The last 30 days are shown by default. Older orders can be found by choosing dates.</w:t>
             </w:r>
           </w:p>
         </w:tc>
@@ -4287,7 +4287,7 @@
                 <w:sz w:val="20"/>
                 <w:szCs w:val="20"/>
               </w:rPr>
-              <w:t xml:space="preserve">Importing sales</w:t>
+              <w:t xml:space="preserve">Business day</w:t>
             </w:r>
           </w:p>
         </w:tc>
@@ -4317,7 +4317,7 @@
                 <w:sz w:val="20"/>
                 <w:szCs w:val="20"/>
               </w:rPr>
-              <w:t xml:space="preserve">Until the API is ready: an admin uploads Rista's downloaded sales file (one month, all branches) and the website loads it, skipping lines it already has. Once the API is ready: every night for the previous day, plus a "refresh now" button for admins.</w:t>
+              <w:t xml:space="preserve">Every sale is counted on Rista's own "Business Date", so our reports always match Rista.</w:t>
             </w:r>
           </w:p>
         </w:tc>
@@ -4415,7 +4415,7 @@
                 <w:sz w:val="20"/>
                 <w:szCs w:val="20"/>
               </w:rPr>
-              <w:t xml:space="preserve">Cancelled and refunded orders</w:t>
+              <w:t xml:space="preserve">Importing sales</w:t>
             </w:r>
           </w:p>
         </w:tc>
@@ -4445,7 +4445,7 @@
                 <w:sz w:val="20"/>
                 <w:szCs w:val="20"/>
               </w:rPr>
-              <w:t xml:space="preserve">Taken from Rista's "Cancelled Transactions" report, listed separately with the reason, and left out of sales totals (Rista already leaves them out).</w:t>
+              <w:t xml:space="preserve">Until the API is ready: an admin uploads Rista's downloaded sales file (one month, all branches) and the website loads it, skipping lines it already has. Once the API is ready: every night for the previous day, plus a "refresh now" button for admins.</w:t>
             </w:r>
           </w:p>
         </w:tc>
@@ -4543,7 +4543,7 @@
                 <w:sz w:val="20"/>
                 <w:szCs w:val="20"/>
               </w:rPr>
-              <w:t xml:space="preserve">Matching Rista dishes to our recipes</w:t>
+              <w:t xml:space="preserve">Cancelled and refunded orders</w:t>
             </w:r>
           </w:p>
         </w:tc>
@@ -4573,7 +4573,7 @@
                 <w:sz w:val="20"/>
                 <w:szCs w:val="20"/>
               </w:rPr>
-              <w:t xml:space="preserve">By Rista's dish code (SKU, for example GIA001), checked against the menu export. Options and add-ons are linked to the dish they were sold with. Codes that do not match are listed for an admin to fix.</w:t>
+              <w:t xml:space="preserve">Taken from Rista's "Cancelled Transactions" report, listed separately with the reason, and left out of sales totals (Rista already leaves them out).</w:t>
             </w:r>
           </w:p>
         </w:tc>
@@ -4671,7 +4671,7 @@
                 <w:sz w:val="20"/>
                 <w:szCs w:val="20"/>
               </w:rPr>
-              <w:t xml:space="preserve">Report downloads</w:t>
+              <w:t xml:space="preserve">Matching Rista dishes to our recipes</w:t>
             </w:r>
           </w:p>
         </w:tc>
@@ -4701,7 +4701,7 @@
                 <w:sz w:val="20"/>
                 <w:szCs w:val="20"/>
               </w:rPr>
-              <w:t xml:space="preserve">Excel and CSV.</w:t>
+              <w:t xml:space="preserve">By Rista's dish code (SKU, for example GIA001), checked against the menu export. Options and add-ons are linked to the dish they were sold with. Codes that do not match are listed for an admin to fix.</w:t>
             </w:r>
           </w:p>
         </w:tc>
@@ -4799,7 +4799,7 @@
                 <w:sz w:val="20"/>
                 <w:szCs w:val="20"/>
               </w:rPr>
-              <w:t xml:space="preserve">Photos over 200 KB</w:t>
+              <w:t xml:space="preserve">Report downloads</w:t>
             </w:r>
           </w:p>
         </w:tc>
@@ -4829,7 +4829,7 @@
                 <w:sz w:val="20"/>
                 <w:szCs w:val="20"/>
               </w:rPr>
-              <w:t xml:space="preserve">The website shrinks them automatically before saving, so owners do not need to resize anything. JPG, PNG and WebP accepted.</w:t>
+              <w:t xml:space="preserve">Excel and CSV.</w:t>
             </w:r>
           </w:p>
         </w:tc>
@@ -4927,7 +4927,7 @@
                 <w:sz w:val="20"/>
                 <w:szCs w:val="20"/>
               </w:rPr>
-              <w:t xml:space="preserve">Which side is correct for menu details</w:t>
+              <w:t xml:space="preserve">Photos over 200 KB</w:t>
             </w:r>
           </w:p>
         </w:tc>
@@ -4957,7 +4957,7 @@
                 <w:sz w:val="20"/>
                 <w:szCs w:val="20"/>
               </w:rPr>
-              <w:t xml:space="preserve">Our website. If someone changes a dish directly in Rista, the website shows the difference so a person can decide. It never overwrites silently.</w:t>
+              <w:t xml:space="preserve">The website shrinks them automatically before saving, so owners do not need to resize anything. JPG, PNG and WebP accepted.</w:t>
             </w:r>
           </w:p>
         </w:tc>
@@ -5055,7 +5055,7 @@
                 <w:sz w:val="20"/>
                 <w:szCs w:val="20"/>
               </w:rPr>
-              <w:t xml:space="preserve">Channel prices</w:t>
+              <w:t xml:space="preserve">Which side is correct for menu details</w:t>
             </w:r>
           </w:p>
         </w:tc>
@@ -5085,7 +5085,7 @@
                 <w:sz w:val="20"/>
                 <w:szCs w:val="20"/>
               </w:rPr>
-              <w:t xml:space="preserve">Keep one price per branch and channel, exactly as Rista does, and send them through Rista's price settings if the API allows it.</w:t>
+              <w:t xml:space="preserve">Our website. If someone changes a dish directly in Rista, the website shows the difference so a person can decide. It never overwrites silently.</w:t>
             </w:r>
           </w:p>
         </w:tc>
@@ -5183,7 +5183,7 @@
                 <w:sz w:val="20"/>
                 <w:szCs w:val="20"/>
               </w:rPr>
-              <w:t xml:space="preserve">Fallback for menu changes</w:t>
+              <w:t xml:space="preserve">Channel prices</w:t>
             </w:r>
           </w:p>
         </w:tc>
@@ -5213,7 +5213,7 @@
                 <w:sz w:val="20"/>
                 <w:szCs w:val="20"/>
               </w:rPr>
-              <w:t xml:space="preserve">If Rista's API cannot change dishes, the website prepares Rista's own "Upload Items" and "Upload Item Price" Excel files for someone to upload.</w:t>
+              <w:t xml:space="preserve">Keep one price per branch and channel, exactly as Rista does, and send them through Rista's price settings if the API allows it.</w:t>
             </w:r>
           </w:p>
         </w:tc>
@@ -5311,7 +5311,7 @@
                 <w:sz w:val="20"/>
                 <w:szCs w:val="20"/>
               </w:rPr>
-              <w:t xml:space="preserve">Failed changes to Rista</w:t>
+              <w:t xml:space="preserve">Fallback for menu changes</w:t>
             </w:r>
           </w:p>
         </w:tc>
@@ -5341,7 +5341,7 @@
                 <w:sz w:val="20"/>
                 <w:szCs w:val="20"/>
               </w:rPr>
-              <w:t xml:space="preserve">Retried automatically. If it still fails, both the person who made the change and the admin see it.</w:t>
+              <w:t xml:space="preserve">If Rista's API cannot change dishes, the website prepares Rista's own "Upload Items" and "Upload Item Price" Excel files for someone to upload.</w:t>
             </w:r>
           </w:p>
         </w:tc>
@@ -5439,7 +5439,7 @@
                 <w:sz w:val="20"/>
                 <w:szCs w:val="20"/>
               </w:rPr>
-              <w:t xml:space="preserve">New-order alert</w:t>
+              <w:t xml:space="preserve">Failed changes to Rista</w:t>
             </w:r>
           </w:p>
         </w:tc>
@@ -5469,7 +5469,7 @@
                 <w:sz w:val="20"/>
                 <w:szCs w:val="20"/>
               </w:rPr>
-              <w:t xml:space="preserve">An on-screen alert with a sound, which each person can switch off.</w:t>
+              <w:t xml:space="preserve">Retried automatically. If it still fails, both the person who made the change and the admin see it.</w:t>
             </w:r>
           </w:p>
         </w:tc>
@@ -5567,7 +5567,7 @@
                 <w:sz w:val="20"/>
                 <w:szCs w:val="20"/>
               </w:rPr>
-              <w:t xml:space="preserve">Forgotten passwords</w:t>
+              <w:t xml:space="preserve">New-order alert</w:t>
             </w:r>
           </w:p>
         </w:tc>
@@ -5597,7 +5597,7 @@
                 <w:sz w:val="20"/>
                 <w:szCs w:val="20"/>
               </w:rPr>
-              <w:t xml:space="preserve">A "Forgot password" link that sends an email. The admin can still reset passwords.</w:t>
+              <w:t xml:space="preserve">An on-screen alert with a sound, which each person can switch off.</w:t>
             </w:r>
           </w:p>
         </w:tc>
@@ -5695,7 +5695,7 @@
                 <w:sz w:val="20"/>
                 <w:szCs w:val="20"/>
               </w:rPr>
-              <w:t xml:space="preserve">One person with several roles</w:t>
+              <w:t xml:space="preserve">Forgotten passwords</w:t>
             </w:r>
           </w:p>
         </w:tc>
@@ -5725,7 +5725,7 @@
                 <w:sz w:val="20"/>
                 <w:szCs w:val="20"/>
               </w:rPr>
-              <w:t xml:space="preserve">Allowed.</w:t>
+              <w:t xml:space="preserve">A "Forgot password" link that sends an email. The admin can still reset passwords.</w:t>
             </w:r>
           </w:p>
         </w:tc>
@@ -5823,7 +5823,7 @@
                 <w:sz w:val="20"/>
                 <w:szCs w:val="20"/>
               </w:rPr>
-              <w:t xml:space="preserve">Customer details</w:t>
+              <w:t xml:space="preserve">One person with several roles</w:t>
             </w:r>
           </w:p>
         </w:tc>
@@ -5853,7 +5853,7 @@
                 <w:sz w:val="20"/>
                 <w:szCs w:val="20"/>
               </w:rPr>
-              <w:t xml:space="preserve">We do not store customer phone numbers or addresses, even though Rista has them on some sales, to follow data protection rules and reduce risk.</w:t>
+              <w:t xml:space="preserve">Allowed.</w:t>
             </w:r>
           </w:p>
         </w:tc>
@@ -5951,7 +5951,7 @@
                 <w:sz w:val="20"/>
                 <w:szCs w:val="20"/>
               </w:rPr>
-              <w:t xml:space="preserve">Item search on more screens</w:t>
+              <w:t xml:space="preserve">Customer details</w:t>
             </w:r>
           </w:p>
         </w:tc>
@@ -5981,7 +5981,7 @@
                 <w:sz w:val="20"/>
                 <w:szCs w:val="20"/>
               </w:rPr>
-              <w:t xml:space="preserve">The same search box will also be added where sub-recipes are picked (Production) and dishes are picked (Sales).</w:t>
+              <w:t xml:space="preserve">We do not store customer phone numbers or addresses, even though Rista has them on some sales, to follow data protection rules and reduce risk.</w:t>
             </w:r>
           </w:p>
         </w:tc>
@@ -6079,7 +6079,7 @@
                 <w:sz w:val="20"/>
                 <w:szCs w:val="20"/>
               </w:rPr>
-              <w:t xml:space="preserve">The Issue step</w:t>
+              <w:t xml:space="preserve">Item search on more screens</w:t>
             </w:r>
           </w:p>
         </w:tc>
@@ -6109,7 +6109,7 @@
                 <w:sz w:val="20"/>
                 <w:szCs w:val="20"/>
               </w:rPr>
-              <w:t xml:space="preserve">Stays as it is: the store issues exactly what the kitchen requested, so nobody picks items there.</w:t>
+              <w:t xml:space="preserve">The same search box will also be added where sub-recipes are picked (Production) and dishes are picked (Sales).</w:t>
             </w:r>
           </w:p>
         </w:tc>
@@ -6207,7 +6207,7 @@
                 <w:sz w:val="20"/>
                 <w:szCs w:val="20"/>
               </w:rPr>
-              <w:t xml:space="preserve">Hosting before real clients use it</w:t>
+              <w:t xml:space="preserve">The Issue step</w:t>
             </w:r>
           </w:p>
         </w:tc>
@@ -6237,7 +6237,7 @@
                 <w:sz w:val="20"/>
                 <w:szCs w:val="20"/>
               </w:rPr>
-              <w:t xml:space="preserve">Move from the free test setup to paid hosting with daily backups and permanent photo storage. About 210 orders a day is small, so a modest plan is enough. We will share the monthly cost for approval first.</w:t>
+              <w:t xml:space="preserve">Stays as it is: the store issues exactly what the kitchen requested, so nobody picks items there.</w:t>
             </w:r>
           </w:p>
         </w:tc>
@@ -6335,7 +6335,7 @@
                 <w:sz w:val="20"/>
                 <w:szCs w:val="20"/>
               </w:rPr>
-              <w:t xml:space="preserve">Security before real clients use it</w:t>
+              <w:t xml:space="preserve">Hosting before real clients use it</w:t>
             </w:r>
           </w:p>
         </w:tc>
@@ -6365,7 +6365,7 @@
                 <w:sz w:val="20"/>
                 <w:szCs w:val="20"/>
               </w:rPr>
-              <w:t xml:space="preserve">Remove the demo logins from the login page, require strong passwords, accept requests only from our own website, and stop putting login keys inside attachment links.</w:t>
+              <w:t xml:space="preserve">Move from the free test setup to paid hosting with daily backups and permanent photo storage. About 210 orders a day is small, so a modest plan is enough. We will share the monthly cost for approval first.</w:t>
             </w:r>
           </w:p>
         </w:tc>
@@ -6463,7 +6463,7 @@
                 <w:sz w:val="20"/>
                 <w:szCs w:val="20"/>
               </w:rPr>
-              <w:t xml:space="preserve">Running alongside the old sheets</w:t>
+              <w:t xml:space="preserve">Security before real clients use it</w:t>
             </w:r>
           </w:p>
         </w:tc>
@@ -6493,7 +6493,7 @@
                 <w:sz w:val="20"/>
                 <w:szCs w:val="20"/>
               </w:rPr>
-              <w:t xml:space="preserve">Keep the current sheets for two weeks after each part goes live, to compare results.</w:t>
+              <w:t xml:space="preserve">Remove the demo logins from the login page, require strong passwords, accept requests only from our own website, and stop putting login keys inside attachment links.</w:t>
             </w:r>
           </w:p>
         </w:tc>
@@ -6560,6 +6560,134 @@
                 <w:szCs w:val="20"/>
               </w:rPr>
               <w:t xml:space="preserve">24</w:t>
+            </w:r>
+          </w:p>
+        </w:tc>
+        <w:tc>
+          <w:tcPr>
+            <w:tcW w:type="dxa" w:w="2300"/>
+            <w:tcBorders>
+              <w:top w:val="single" w:color="BFBFBF" w:sz="4"/>
+              <w:left w:val="single" w:color="BFBFBF" w:sz="4"/>
+              <w:bottom w:val="single" w:color="BFBFBF" w:sz="4"/>
+              <w:right w:val="single" w:color="BFBFBF" w:sz="4"/>
+            </w:tcBorders>
+            <w:tcMar>
+              <w:top w:type="dxa" w:w="70"/>
+              <w:left w:type="dxa" w:w="110"/>
+              <w:bottom w:type="dxa" w:w="70"/>
+              <w:right w:type="dxa" w:w="110"/>
+            </w:tcMar>
+            <w:vAlign w:val="top"/>
+          </w:tcPr>
+          <w:p>
+            <w:pPr>
+              <w:spacing w:after="40" w:line="252"/>
+            </w:pPr>
+            <w:r>
+              <w:rPr>
+                <w:b/>
+                <w:bCs/>
+                <w:sz w:val="20"/>
+                <w:szCs w:val="20"/>
+              </w:rPr>
+              <w:t xml:space="preserve">Running alongside the old sheets</w:t>
+            </w:r>
+          </w:p>
+        </w:tc>
+        <w:tc>
+          <w:tcPr>
+            <w:tcW w:type="dxa" w:w="5046"/>
+            <w:tcBorders>
+              <w:top w:val="single" w:color="BFBFBF" w:sz="4"/>
+              <w:left w:val="single" w:color="BFBFBF" w:sz="4"/>
+              <w:bottom w:val="single" w:color="BFBFBF" w:sz="4"/>
+              <w:right w:val="single" w:color="BFBFBF" w:sz="4"/>
+            </w:tcBorders>
+            <w:tcMar>
+              <w:top w:type="dxa" w:w="70"/>
+              <w:left w:type="dxa" w:w="110"/>
+              <w:bottom w:type="dxa" w:w="70"/>
+              <w:right w:type="dxa" w:w="110"/>
+            </w:tcMar>
+            <w:vAlign w:val="top"/>
+          </w:tcPr>
+          <w:p>
+            <w:pPr>
+              <w:spacing w:after="40" w:line="252"/>
+            </w:pPr>
+            <w:r>
+              <w:rPr>
+                <w:sz w:val="20"/>
+                <w:szCs w:val="20"/>
+              </w:rPr>
+              <w:t xml:space="preserve">Keep the current sheets for two weeks after each part goes live, to compare results.</w:t>
+            </w:r>
+          </w:p>
+        </w:tc>
+        <w:tc>
+          <w:tcPr>
+            <w:tcW w:type="dxa" w:w="1800"/>
+            <w:tcBorders>
+              <w:top w:val="single" w:color="BFBFBF" w:sz="4"/>
+              <w:left w:val="single" w:color="BFBFBF" w:sz="4"/>
+              <w:bottom w:val="single" w:color="BFBFBF" w:sz="4"/>
+              <w:right w:val="single" w:color="BFBFBF" w:sz="4"/>
+            </w:tcBorders>
+            <w:shd w:fill="FFF7D6" w:color="auto" w:val="clear"/>
+            <w:tcMar>
+              <w:top w:type="dxa" w:w="70"/>
+              <w:left w:type="dxa" w:w="110"/>
+              <w:bottom w:type="dxa" w:w="70"/>
+              <w:right w:type="dxa" w:w="110"/>
+            </w:tcMar>
+            <w:vAlign w:val="top"/>
+          </w:tcPr>
+          <w:p>
+            <w:pPr>
+              <w:spacing w:after="40" w:line="252"/>
+            </w:pPr>
+            <w:r>
+              <w:rPr>
+                <w:sz w:val="20"/>
+                <w:szCs w:val="20"/>
+              </w:rPr>
+              <w:t xml:space="preserve"/>
+            </w:r>
+          </w:p>
+        </w:tc>
+      </w:tr>
+      <w:tr>
+        <w:trPr>
+          <w:cantSplit/>
+        </w:trPr>
+        <w:tc>
+          <w:tcPr>
+            <w:tcW w:type="dxa" w:w="600"/>
+            <w:tcBorders>
+              <w:top w:val="single" w:color="BFBFBF" w:sz="4"/>
+              <w:left w:val="single" w:color="BFBFBF" w:sz="4"/>
+              <w:bottom w:val="single" w:color="BFBFBF" w:sz="4"/>
+              <w:right w:val="single" w:color="BFBFBF" w:sz="4"/>
+            </w:tcBorders>
+            <w:tcMar>
+              <w:top w:type="dxa" w:w="70"/>
+              <w:left w:type="dxa" w:w="110"/>
+              <w:bottom w:type="dxa" w:w="70"/>
+              <w:right w:type="dxa" w:w="110"/>
+            </w:tcMar>
+            <w:vAlign w:val="top"/>
+          </w:tcPr>
+          <w:p>
+            <w:pPr>
+              <w:spacing w:after="40" w:line="252"/>
+            </w:pPr>
+            <w:r>
+              <w:rPr>
+                <w:sz w:val="20"/>
+                <w:szCs w:val="20"/>
+              </w:rPr>
+              <w:t xml:space="preserve">25</w:t>
             </w:r>
           </w:p>
         </w:tc>
@@ -7860,46 +7988,7 @@
                 <w:sz w:val="20"/>
                 <w:szCs w:val="20"/>
               </w:rPr>
-              <w:t xml:space="preserve">Which website should these changes be made in? (The company's MongoDB account also holds another app's data, with orders, item masters, ingredient indents and menu entries, which looks like a different website. If that is the one your team uses every day, the work may belong there.)</w:t>
-            </w:r>
-          </w:p>
-          <w:p>
-            <w:pPr>
-              <w:spacing w:after="40" w:line="252"/>
-              <w:ind w:left="200"/>
-            </w:pPr>
-            <w:r>
-              <w:rPr>
-                <w:sz w:val="20"/>
-                <w:szCs w:val="20"/>
-              </w:rPr>
-              <w:t xml:space="preserve">A) This project, the Skope Operations Platform (test copy: skope-operations-platform.onrender.com)</w:t>
-            </w:r>
-          </w:p>
-          <w:p>
-            <w:pPr>
-              <w:spacing w:after="40" w:line="252"/>
-              <w:ind w:left="200"/>
-            </w:pPr>
-            <w:r>
-              <w:rPr>
-                <w:sz w:val="20"/>
-                <w:szCs w:val="20"/>
-              </w:rPr>
-              <w:t xml:space="preserve">B) A different website the team already uses (please share its link and who has its code)</w:t>
-            </w:r>
-          </w:p>
-          <w:p>
-            <w:pPr>
-              <w:spacing w:after="40" w:line="252"/>
-              <w:ind w:left="200"/>
-            </w:pPr>
-            <w:r>
-              <w:rPr>
-                <w:sz w:val="20"/>
-                <w:szCs w:val="20"/>
-              </w:rPr>
-              <w:t xml:space="preserve">C) Not sure</w:t>
+              <w:t xml:space="preserve">The company's database account also holds data from another app (orders, item masters, ingredient indents, menu entries). Which app is that, and is it still in use? We ask so we do not rebuild something that already exists.</w:t>
             </w:r>
           </w:p>
         </w:tc>
@@ -7929,7 +8018,7 @@
                 <w:sz w:val="20"/>
                 <w:szCs w:val="20"/>
               </w:rPr>
-              <w:t xml:space="preserve">Pick one</w:t>
+              <w:t xml:space="preserve">Short answer</w:t>
             </w:r>
           </w:p>
         </w:tc>
@@ -7956,13 +8045,11 @@
             </w:pPr>
             <w:r>
               <w:rPr>
-                <w:b/>
-                <w:bCs/>
-                <w:color w:val="C00000"/>
-                <w:sz w:val="20"/>
-                <w:szCs w:val="20"/>
-              </w:rPr>
-              <w:t xml:space="preserve">Before start</w:t>
+                <w:color w:val="595959"/>
+                <w:sz w:val="20"/>
+                <w:szCs w:val="20"/>
+              </w:rPr>
+              <w:t xml:space="preserve">Later</w:t>
             </w:r>
           </w:p>
         </w:tc>

</xml_diff>

<commit_message>
Docs: requirements document now explains what is already built, in plain language
Co-Authored-By: Claude Sonnet 5.5 <noreply@anthropic.com>
</commit_message>
<xml_diff>
--- a/docs/Skope-Next-Phase-Questions-v2.docx
+++ b/docs/Skope-Next-Phase-Questions-v2.docx
@@ -43,7 +43,7 @@
           <w:sz w:val="20"/>
           <w:szCs w:val="20"/>
         </w:rPr>
-        <w:t xml:space="preserve">Prepared by Youvraj · 20 October 2026 · Version 2</w:t>
+        <w:t xml:space="preserve">Prepared by Youvraj · 20 October 2026 · Version 2, with the progress so far</w:t>
       </w:r>
     </w:p>
     <w:p>
@@ -75,7 +75,15 @@
         <w:spacing w:after="120" w:line="276"/>
       </w:pPr>
       <w:r>
-        <w:t xml:space="preserve">The document has four parts: what was requested, what we learned from Rista, the technical decisions we have already made (you only agree or disagree), and the questions only your team can answer.</w:t>
+        <w:t xml:space="preserve">Some of the work needed no answers, so it is already built and running on the test website. Section 2 explains it in plain words and shows how to try it yourself.</w:t>
+      </w:r>
+    </w:p>
+    <w:p>
+      <w:pPr>
+        <w:spacing w:after="120" w:line="276"/>
+      </w:pPr>
+      <w:r>
+        <w:t xml:space="preserve">The document covers what was requested and what is already working, what we learned from Rista, the technical decisions we have already made (you only agree or disagree), and the questions only your team can answer.</w:t>
       </w:r>
     </w:p>
     <w:p>
@@ -1298,11 +1306,13 @@
             </w:pPr>
             <w:r>
               <w:rPr>
-                <w:color w:val="595959"/>
-                <w:sz w:val="20"/>
-                <w:szCs w:val="20"/>
-              </w:rPr>
-              <w:t xml:space="preserve">Needs answers and DotPe access</w:t>
+                <w:b/>
+                <w:bCs/>
+                <w:color w:val="2E7D32"/>
+                <w:sz w:val="20"/>
+                <w:szCs w:val="20"/>
+              </w:rPr>
+              <w:t xml:space="preserve">Partly built: the admin view works from Rista files; the client view needs answers</w:t>
             </w:r>
           </w:p>
         </w:tc>
@@ -1556,11 +1566,13 @@
             </w:pPr>
             <w:r>
               <w:rPr>
-                <w:color w:val="595959"/>
-                <w:sz w:val="20"/>
-                <w:szCs w:val="20"/>
-              </w:rPr>
-              <w:t xml:space="preserve">Needs answers and DotPe access</w:t>
+                <w:b/>
+                <w:bCs/>
+                <w:color w:val="2E7D32"/>
+                <w:sz w:val="20"/>
+                <w:szCs w:val="20"/>
+              </w:rPr>
+              <w:t xml:space="preserve">Partly built: the Rista menu can be viewed; sending changes needs DotPe access</w:t>
             </w:r>
           </w:p>
         </w:tc>
@@ -1824,6 +1836,691 @@
         </w:tc>
       </w:tr>
     </w:tbl>
+    <w:p>
+      <w:pPr>
+        <w:pStyle w:val="Heading2"/>
+      </w:pPr>
+      <w:r>
+        <w:t xml:space="preserve">What is already working</w:t>
+      </w:r>
+    </w:p>
+    <w:p>
+      <w:pPr>
+        <w:spacing w:after="120" w:line="276"/>
+      </w:pPr>
+      <w:r>
+        <w:t xml:space="preserve">Some of the work did not need any answers or DotPe access, so it is already built and running on the test website (skope-operations-platform.onrender.com). Here is what it does, in plain words.</w:t>
+      </w:r>
+    </w:p>
+    <w:tbl>
+      <w:tblPr>
+        <w:tblW w:type="dxa" w:w="9746"/>
+        <w:tblBorders>
+          <w:top w:val="single" w:color="auto" w:sz="4"/>
+          <w:left w:val="single" w:color="auto" w:sz="4"/>
+          <w:bottom w:val="single" w:color="auto" w:sz="4"/>
+          <w:right w:val="single" w:color="auto" w:sz="4"/>
+          <w:insideH w:val="single" w:color="auto" w:sz="4"/>
+          <w:insideV w:val="single" w:color="auto" w:sz="4"/>
+        </w:tblBorders>
+      </w:tblPr>
+      <w:tblGrid>
+        <w:gridCol w:w="2300"/>
+        <w:gridCol w:w="7446"/>
+      </w:tblGrid>
+      <w:tr>
+        <w:trPr>
+          <w:tblHeader/>
+        </w:trPr>
+        <w:tc>
+          <w:tcPr>
+            <w:tcW w:type="dxa" w:w="2300"/>
+            <w:tcBorders>
+              <w:top w:val="single" w:color="BFBFBF" w:sz="4"/>
+              <w:left w:val="single" w:color="BFBFBF" w:sz="4"/>
+              <w:bottom w:val="single" w:color="BFBFBF" w:sz="4"/>
+              <w:right w:val="single" w:color="BFBFBF" w:sz="4"/>
+            </w:tcBorders>
+            <w:shd w:fill="D9E2F3" w:color="auto" w:val="clear"/>
+            <w:tcMar>
+              <w:top w:type="dxa" w:w="70"/>
+              <w:left w:type="dxa" w:w="110"/>
+              <w:bottom w:type="dxa" w:w="70"/>
+              <w:right w:type="dxa" w:w="110"/>
+            </w:tcMar>
+            <w:vAlign w:val="top"/>
+          </w:tcPr>
+          <w:p>
+            <w:pPr>
+              <w:spacing w:after="40" w:line="252"/>
+            </w:pPr>
+            <w:r>
+              <w:rPr>
+                <w:b/>
+                <w:bCs/>
+                <w:color w:val="1F3864"/>
+                <w:sz w:val="20"/>
+                <w:szCs w:val="20"/>
+              </w:rPr>
+              <w:t xml:space="preserve">What</w:t>
+            </w:r>
+          </w:p>
+        </w:tc>
+        <w:tc>
+          <w:tcPr>
+            <w:tcW w:type="dxa" w:w="7446"/>
+            <w:tcBorders>
+              <w:top w:val="single" w:color="BFBFBF" w:sz="4"/>
+              <w:left w:val="single" w:color="BFBFBF" w:sz="4"/>
+              <w:bottom w:val="single" w:color="BFBFBF" w:sz="4"/>
+              <w:right w:val="single" w:color="BFBFBF" w:sz="4"/>
+            </w:tcBorders>
+            <w:shd w:fill="D9E2F3" w:color="auto" w:val="clear"/>
+            <w:tcMar>
+              <w:top w:type="dxa" w:w="70"/>
+              <w:left w:type="dxa" w:w="110"/>
+              <w:bottom w:type="dxa" w:w="70"/>
+              <w:right w:type="dxa" w:w="110"/>
+            </w:tcMar>
+            <w:vAlign w:val="top"/>
+          </w:tcPr>
+          <w:p>
+            <w:pPr>
+              <w:spacing w:after="40" w:line="252"/>
+            </w:pPr>
+            <w:r>
+              <w:rPr>
+                <w:b/>
+                <w:bCs/>
+                <w:color w:val="1F3864"/>
+                <w:sz w:val="20"/>
+                <w:szCs w:val="20"/>
+              </w:rPr>
+              <w:t xml:space="preserve">What it does</w:t>
+            </w:r>
+          </w:p>
+        </w:tc>
+      </w:tr>
+      <w:tr>
+        <w:trPr>
+          <w:cantSplit/>
+        </w:trPr>
+        <w:tc>
+          <w:tcPr>
+            <w:tcW w:type="dxa" w:w="2300"/>
+            <w:tcBorders>
+              <w:top w:val="single" w:color="BFBFBF" w:sz="4"/>
+              <w:left w:val="single" w:color="BFBFBF" w:sz="4"/>
+              <w:bottom w:val="single" w:color="BFBFBF" w:sz="4"/>
+              <w:right w:val="single" w:color="BFBFBF" w:sz="4"/>
+            </w:tcBorders>
+            <w:tcMar>
+              <w:top w:type="dxa" w:w="70"/>
+              <w:left w:type="dxa" w:w="110"/>
+              <w:bottom w:type="dxa" w:w="70"/>
+              <w:right w:type="dxa" w:w="110"/>
+            </w:tcMar>
+            <w:vAlign w:val="top"/>
+          </w:tcPr>
+          <w:p>
+            <w:pPr>
+              <w:spacing w:after="40" w:line="252"/>
+            </w:pPr>
+            <w:r>
+              <w:rPr>
+                <w:b/>
+                <w:bCs/>
+                <w:sz w:val="20"/>
+                <w:szCs w:val="20"/>
+              </w:rPr>
+              <w:t xml:space="preserve">Search boxes</w:t>
+            </w:r>
+          </w:p>
+        </w:tc>
+        <w:tc>
+          <w:tcPr>
+            <w:tcW w:type="dxa" w:w="7446"/>
+            <w:tcBorders>
+              <w:top w:val="single" w:color="BFBFBF" w:sz="4"/>
+              <w:left w:val="single" w:color="BFBFBF" w:sz="4"/>
+              <w:bottom w:val="single" w:color="BFBFBF" w:sz="4"/>
+              <w:right w:val="single" w:color="BFBFBF" w:sz="4"/>
+            </w:tcBorders>
+            <w:tcMar>
+              <w:top w:type="dxa" w:w="70"/>
+              <w:left w:type="dxa" w:w="110"/>
+              <w:bottom w:type="dxa" w:w="70"/>
+              <w:right w:type="dxa" w:w="110"/>
+            </w:tcMar>
+            <w:vAlign w:val="top"/>
+          </w:tcPr>
+          <w:p>
+            <w:pPr>
+              <w:spacing w:after="40" w:line="252"/>
+            </w:pPr>
+            <w:r>
+              <w:rPr>
+                <w:sz w:val="20"/>
+                <w:szCs w:val="20"/>
+              </w:rPr>
+              <w:t xml:space="preserve">Wherever someone has to pick something (an ingredient, a dish, a prepared base), they type a few letters and the website shows the matches, instead of scrolling a long list. It works the same way on every screen, also on a phone. The last two places, Sales and Production, were added this week.</w:t>
+            </w:r>
+          </w:p>
+        </w:tc>
+      </w:tr>
+      <w:tr>
+        <w:trPr>
+          <w:cantSplit/>
+        </w:trPr>
+        <w:tc>
+          <w:tcPr>
+            <w:tcW w:type="dxa" w:w="2300"/>
+            <w:tcBorders>
+              <w:top w:val="single" w:color="BFBFBF" w:sz="4"/>
+              <w:left w:val="single" w:color="BFBFBF" w:sz="4"/>
+              <w:bottom w:val="single" w:color="BFBFBF" w:sz="4"/>
+              <w:right w:val="single" w:color="BFBFBF" w:sz="4"/>
+            </w:tcBorders>
+            <w:tcMar>
+              <w:top w:type="dxa" w:w="70"/>
+              <w:left w:type="dxa" w:w="110"/>
+              <w:bottom w:type="dxa" w:w="70"/>
+              <w:right w:type="dxa" w:w="110"/>
+            </w:tcMar>
+            <w:vAlign w:val="top"/>
+          </w:tcPr>
+          <w:p>
+            <w:pPr>
+              <w:spacing w:after="40" w:line="252"/>
+            </w:pPr>
+            <w:r>
+              <w:rPr>
+                <w:b/>
+                <w:bCs/>
+                <w:sz w:val="20"/>
+                <w:szCs w:val="20"/>
+              </w:rPr>
+              <w:t xml:space="preserve">Rista Sales page</w:t>
+            </w:r>
+          </w:p>
+        </w:tc>
+        <w:tc>
+          <w:tcPr>
+            <w:tcW w:type="dxa" w:w="7446"/>
+            <w:tcBorders>
+              <w:top w:val="single" w:color="BFBFBF" w:sz="4"/>
+              <w:left w:val="single" w:color="BFBFBF" w:sz="4"/>
+              <w:bottom w:val="single" w:color="BFBFBF" w:sz="4"/>
+              <w:right w:val="single" w:color="BFBFBF" w:sz="4"/>
+            </w:tcBorders>
+            <w:shd w:fill="F5F7FB" w:color="auto" w:val="clear"/>
+            <w:tcMar>
+              <w:top w:type="dxa" w:w="70"/>
+              <w:left w:type="dxa" w:w="110"/>
+              <w:bottom w:type="dxa" w:w="70"/>
+              <w:right w:type="dxa" w:w="110"/>
+            </w:tcMar>
+            <w:vAlign w:val="top"/>
+          </w:tcPr>
+          <w:p>
+            <w:pPr>
+              <w:spacing w:after="40" w:line="252"/>
+            </w:pPr>
+            <w:r>
+              <w:rPr>
+                <w:sz w:val="20"/>
+                <w:szCs w:val="20"/>
+              </w:rPr>
+              <w:t xml:space="preserve">A new page called "Rista Sales" in the left menu. It shows the sales from Rista: how much was sold, how many orders, and the split by brand, branch, Swiggy, Zomato, Ownly and in-store, plus the dishes that sell most. You can choose the dates, a branch or a brand, and download the result as an Excel or CSV file.</w:t>
+            </w:r>
+          </w:p>
+        </w:tc>
+      </w:tr>
+      <w:tr>
+        <w:trPr>
+          <w:cantSplit/>
+        </w:trPr>
+        <w:tc>
+          <w:tcPr>
+            <w:tcW w:type="dxa" w:w="2300"/>
+            <w:tcBorders>
+              <w:top w:val="single" w:color="BFBFBF" w:sz="4"/>
+              <w:left w:val="single" w:color="BFBFBF" w:sz="4"/>
+              <w:bottom w:val="single" w:color="BFBFBF" w:sz="4"/>
+              <w:right w:val="single" w:color="BFBFBF" w:sz="4"/>
+            </w:tcBorders>
+            <w:tcMar>
+              <w:top w:type="dxa" w:w="70"/>
+              <w:left w:type="dxa" w:w="110"/>
+              <w:bottom w:type="dxa" w:w="70"/>
+              <w:right w:type="dxa" w:w="110"/>
+            </w:tcMar>
+            <w:vAlign w:val="top"/>
+          </w:tcPr>
+          <w:p>
+            <w:pPr>
+              <w:spacing w:after="40" w:line="252"/>
+            </w:pPr>
+            <w:r>
+              <w:rPr>
+                <w:b/>
+                <w:bCs/>
+                <w:sz w:val="20"/>
+                <w:szCs w:val="20"/>
+              </w:rPr>
+              <w:t xml:space="preserve">Bringing Rista data in</w:t>
+            </w:r>
+          </w:p>
+        </w:tc>
+        <w:tc>
+          <w:tcPr>
+            <w:tcW w:type="dxa" w:w="7446"/>
+            <w:tcBorders>
+              <w:top w:val="single" w:color="BFBFBF" w:sz="4"/>
+              <w:left w:val="single" w:color="BFBFBF" w:sz="4"/>
+              <w:bottom w:val="single" w:color="BFBFBF" w:sz="4"/>
+              <w:right w:val="single" w:color="BFBFBF" w:sz="4"/>
+            </w:tcBorders>
+            <w:tcMar>
+              <w:top w:type="dxa" w:w="70"/>
+              <w:left w:type="dxa" w:w="110"/>
+              <w:bottom w:type="dxa" w:w="70"/>
+              <w:right w:type="dxa" w:w="110"/>
+            </w:tcMar>
+            <w:vAlign w:val="top"/>
+          </w:tcPr>
+          <w:p>
+            <w:pPr>
+              <w:spacing w:after="40" w:line="252"/>
+            </w:pPr>
+            <w:r>
+              <w:rPr>
+                <w:sz w:val="20"/>
+                <w:szCs w:val="20"/>
+              </w:rPr>
+              <w:t xml:space="preserve">Until DotPe gives us access, an admin downloads three reports from Rista (sales, cancelled orders and the menu) and uploads them to the website. It takes a few seconds. Uploading the same days again does not count them twice. The website does not keep customer names or phone numbers.</w:t>
+            </w:r>
+          </w:p>
+        </w:tc>
+      </w:tr>
+      <w:tr>
+        <w:trPr>
+          <w:cantSplit/>
+        </w:trPr>
+        <w:tc>
+          <w:tcPr>
+            <w:tcW w:type="dxa" w:w="2300"/>
+            <w:tcBorders>
+              <w:top w:val="single" w:color="BFBFBF" w:sz="4"/>
+              <w:left w:val="single" w:color="BFBFBF" w:sz="4"/>
+              <w:bottom w:val="single" w:color="BFBFBF" w:sz="4"/>
+              <w:right w:val="single" w:color="BFBFBF" w:sz="4"/>
+            </w:tcBorders>
+            <w:tcMar>
+              <w:top w:type="dxa" w:w="70"/>
+              <w:left w:type="dxa" w:w="110"/>
+              <w:bottom w:type="dxa" w:w="70"/>
+              <w:right w:type="dxa" w:w="110"/>
+            </w:tcMar>
+            <w:vAlign w:val="top"/>
+          </w:tcPr>
+          <w:p>
+            <w:pPr>
+              <w:spacing w:after="40" w:line="252"/>
+            </w:pPr>
+            <w:r>
+              <w:rPr>
+                <w:b/>
+                <w:bCs/>
+                <w:sz w:val="20"/>
+                <w:szCs w:val="20"/>
+              </w:rPr>
+              <w:t xml:space="preserve">Cancelled orders</w:t>
+            </w:r>
+          </w:p>
+        </w:tc>
+        <w:tc>
+          <w:tcPr>
+            <w:tcW w:type="dxa" w:w="7446"/>
+            <w:tcBorders>
+              <w:top w:val="single" w:color="BFBFBF" w:sz="4"/>
+              <w:left w:val="single" w:color="BFBFBF" w:sz="4"/>
+              <w:bottom w:val="single" w:color="BFBFBF" w:sz="4"/>
+              <w:right w:val="single" w:color="BFBFBF" w:sz="4"/>
+            </w:tcBorders>
+            <w:shd w:fill="F5F7FB" w:color="auto" w:val="clear"/>
+            <w:tcMar>
+              <w:top w:type="dxa" w:w="70"/>
+              <w:left w:type="dxa" w:w="110"/>
+              <w:bottom w:type="dxa" w:w="70"/>
+              <w:right w:type="dxa" w:w="110"/>
+            </w:tcMar>
+            <w:vAlign w:val="top"/>
+          </w:tcPr>
+          <w:p>
+            <w:pPr>
+              <w:spacing w:after="40" w:line="252"/>
+            </w:pPr>
+            <w:r>
+              <w:rPr>
+                <w:sz w:val="20"/>
+                <w:szCs w:val="20"/>
+              </w:rPr>
+              <w:t xml:space="preserve">The 77 cancelled orders of the month (about ₹27,800) are listed with the reason and who cancelled them: Zomato, Swiggy or Ownly automatically, or a staff member. They are kept apart from sales, so the sales totals stay correct.</w:t>
+            </w:r>
+          </w:p>
+        </w:tc>
+      </w:tr>
+      <w:tr>
+        <w:trPr>
+          <w:cantSplit/>
+        </w:trPr>
+        <w:tc>
+          <w:tcPr>
+            <w:tcW w:type="dxa" w:w="2300"/>
+            <w:tcBorders>
+              <w:top w:val="single" w:color="BFBFBF" w:sz="4"/>
+              <w:left w:val="single" w:color="BFBFBF" w:sz="4"/>
+              <w:bottom w:val="single" w:color="BFBFBF" w:sz="4"/>
+              <w:right w:val="single" w:color="BFBFBF" w:sz="4"/>
+            </w:tcBorders>
+            <w:tcMar>
+              <w:top w:type="dxa" w:w="70"/>
+              <w:left w:type="dxa" w:w="110"/>
+              <w:bottom w:type="dxa" w:w="70"/>
+              <w:right w:type="dxa" w:w="110"/>
+            </w:tcMar>
+            <w:vAlign w:val="top"/>
+          </w:tcPr>
+          <w:p>
+            <w:pPr>
+              <w:spacing w:after="40" w:line="252"/>
+            </w:pPr>
+            <w:r>
+              <w:rPr>
+                <w:b/>
+                <w:bCs/>
+                <w:sz w:val="20"/>
+                <w:szCs w:val="20"/>
+              </w:rPr>
+              <w:t xml:space="preserve">The Rista menu</w:t>
+            </w:r>
+          </w:p>
+        </w:tc>
+        <w:tc>
+          <w:tcPr>
+            <w:tcW w:type="dxa" w:w="7446"/>
+            <w:tcBorders>
+              <w:top w:val="single" w:color="BFBFBF" w:sz="4"/>
+              <w:left w:val="single" w:color="BFBFBF" w:sz="4"/>
+              <w:bottom w:val="single" w:color="BFBFBF" w:sz="4"/>
+              <w:right w:val="single" w:color="BFBFBF" w:sz="4"/>
+            </w:tcBorders>
+            <w:tcMar>
+              <w:top w:type="dxa" w:w="70"/>
+              <w:left w:type="dxa" w:w="110"/>
+              <w:bottom w:type="dxa" w:w="70"/>
+              <w:right w:type="dxa" w:w="110"/>
+            </w:tcMar>
+            <w:vAlign w:val="top"/>
+          </w:tcPr>
+          <w:p>
+            <w:pPr>
+              <w:spacing w:after="40" w:line="252"/>
+            </w:pPr>
+            <w:r>
+              <w:rPr>
+                <w:sz w:val="20"/>
+                <w:szCs w:val="20"/>
+              </w:rPr>
+              <w:t xml:space="preserve">All 1,507 dishes, with the price for every branch and channel. The page also warns about dish codes that were sold but are missing from the menu file (2 found), and shows which sold dishes have no recipe in our website yet.</w:t>
+            </w:r>
+          </w:p>
+        </w:tc>
+      </w:tr>
+      <w:tr>
+        <w:trPr>
+          <w:cantSplit/>
+        </w:trPr>
+        <w:tc>
+          <w:tcPr>
+            <w:tcW w:type="dxa" w:w="2300"/>
+            <w:tcBorders>
+              <w:top w:val="single" w:color="BFBFBF" w:sz="4"/>
+              <w:left w:val="single" w:color="BFBFBF" w:sz="4"/>
+              <w:bottom w:val="single" w:color="BFBFBF" w:sz="4"/>
+              <w:right w:val="single" w:color="BFBFBF" w:sz="4"/>
+            </w:tcBorders>
+            <w:tcMar>
+              <w:top w:type="dxa" w:w="70"/>
+              <w:left w:type="dxa" w:w="110"/>
+              <w:bottom w:type="dxa" w:w="70"/>
+              <w:right w:type="dxa" w:w="110"/>
+            </w:tcMar>
+            <w:vAlign w:val="top"/>
+          </w:tcPr>
+          <w:p>
+            <w:pPr>
+              <w:spacing w:after="40" w:line="252"/>
+            </w:pPr>
+            <w:r>
+              <w:rPr>
+                <w:b/>
+                <w:bCs/>
+                <w:sz w:val="20"/>
+                <w:szCs w:val="20"/>
+              </w:rPr>
+              <w:t xml:space="preserve">Checked against Rista</w:t>
+            </w:r>
+          </w:p>
+        </w:tc>
+        <w:tc>
+          <w:tcPr>
+            <w:tcW w:type="dxa" w:w="7446"/>
+            <w:tcBorders>
+              <w:top w:val="single" w:color="BFBFBF" w:sz="4"/>
+              <w:left w:val="single" w:color="BFBFBF" w:sz="4"/>
+              <w:bottom w:val="single" w:color="BFBFBF" w:sz="4"/>
+              <w:right w:val="single" w:color="BFBFBF" w:sz="4"/>
+            </w:tcBorders>
+            <w:shd w:fill="F5F7FB" w:color="auto" w:val="clear"/>
+            <w:tcMar>
+              <w:top w:type="dxa" w:w="70"/>
+              <w:left w:type="dxa" w:w="110"/>
+              <w:bottom w:type="dxa" w:w="70"/>
+              <w:right w:type="dxa" w:w="110"/>
+            </w:tcMar>
+            <w:vAlign w:val="top"/>
+          </w:tcPr>
+          <w:p>
+            <w:pPr>
+              <w:spacing w:after="40" w:line="252"/>
+            </w:pPr>
+            <w:r>
+              <w:rPr>
+                <w:sz w:val="20"/>
+                <w:szCs w:val="20"/>
+              </w:rPr>
+              <w:t xml:space="preserve">For 19 September to 19 October, the totals on our page are exactly the totals in the Rista download: 6,520 orders and ₹20,35,097.62 net sales.</w:t>
+            </w:r>
+          </w:p>
+        </w:tc>
+      </w:tr>
+      <w:tr>
+        <w:trPr>
+          <w:cantSplit/>
+        </w:trPr>
+        <w:tc>
+          <w:tcPr>
+            <w:tcW w:type="dxa" w:w="2300"/>
+            <w:tcBorders>
+              <w:top w:val="single" w:color="BFBFBF" w:sz="4"/>
+              <w:left w:val="single" w:color="BFBFBF" w:sz="4"/>
+              <w:bottom w:val="single" w:color="BFBFBF" w:sz="4"/>
+              <w:right w:val="single" w:color="BFBFBF" w:sz="4"/>
+            </w:tcBorders>
+            <w:tcMar>
+              <w:top w:type="dxa" w:w="70"/>
+              <w:left w:type="dxa" w:w="110"/>
+              <w:bottom w:type="dxa" w:w="70"/>
+              <w:right w:type="dxa" w:w="110"/>
+            </w:tcMar>
+            <w:vAlign w:val="top"/>
+          </w:tcPr>
+          <w:p>
+            <w:pPr>
+              <w:spacing w:after="40" w:line="252"/>
+            </w:pPr>
+            <w:r>
+              <w:rPr>
+                <w:b/>
+                <w:bCs/>
+                <w:sz w:val="20"/>
+                <w:szCs w:val="20"/>
+              </w:rPr>
+              <w:t xml:space="preserve">Who can see it</w:t>
+            </w:r>
+          </w:p>
+        </w:tc>
+        <w:tc>
+          <w:tcPr>
+            <w:tcW w:type="dxa" w:w="7446"/>
+            <w:tcBorders>
+              <w:top w:val="single" w:color="BFBFBF" w:sz="4"/>
+              <w:left w:val="single" w:color="BFBFBF" w:sz="4"/>
+              <w:bottom w:val="single" w:color="BFBFBF" w:sz="4"/>
+              <w:right w:val="single" w:color="BFBFBF" w:sz="4"/>
+            </w:tcBorders>
+            <w:tcMar>
+              <w:top w:type="dxa" w:w="70"/>
+              <w:left w:type="dxa" w:w="110"/>
+              <w:bottom w:type="dxa" w:w="70"/>
+              <w:right w:type="dxa" w:w="110"/>
+            </w:tcMar>
+            <w:vAlign w:val="top"/>
+          </w:tcPr>
+          <w:p>
+            <w:pPr>
+              <w:spacing w:after="40" w:line="252"/>
+            </w:pPr>
+            <w:r>
+              <w:rPr>
+                <w:sz w:val="20"/>
+                <w:szCs w:val="20"/>
+              </w:rPr>
+              <w:t xml:space="preserve">Admin and Management can open the Rista Sales page. Only the admin can upload files. The other roles do not see it.</w:t>
+            </w:r>
+          </w:p>
+        </w:tc>
+      </w:tr>
+    </w:tbl>
+    <w:p>
+      <w:pPr>
+        <w:pStyle w:val="Heading2"/>
+      </w:pPr>
+      <w:r>
+        <w:t xml:space="preserve">How to try it</w:t>
+      </w:r>
+    </w:p>
+    <w:p>
+      <w:pPr>
+        <w:pStyle w:val="ListParagraph"/>
+        <w:numPr>
+          <w:ilvl w:val="0"/>
+          <w:numId w:val="2"/>
+        </w:numPr>
+        <w:spacing w:after="60"/>
+      </w:pPr>
+      <w:r>
+        <w:t xml:space="preserve">Open the test website, log in with the admin login we shared earlier, and click "Rista Sales" in the left menu. The sales of 19 September to 19 October are already loaded.</w:t>
+      </w:r>
+    </w:p>
+    <w:p>
+      <w:pPr>
+        <w:pStyle w:val="ListParagraph"/>
+        <w:numPr>
+          <w:ilvl w:val="0"/>
+          <w:numId w:val="2"/>
+        </w:numPr>
+        <w:spacing w:after="60"/>
+      </w:pPr>
+      <w:r>
+        <w:t xml:space="preserve">Try the filters, open the Cancelled orders and Menu tabs, and download a file.</w:t>
+      </w:r>
+    </w:p>
+    <w:p>
+      <w:pPr>
+        <w:pStyle w:val="ListParagraph"/>
+        <w:numPr>
+          <w:ilvl w:val="0"/>
+          <w:numId w:val="2"/>
+        </w:numPr>
+        <w:spacing w:after="60"/>
+      </w:pPr>
+      <w:r>
+        <w:t xml:space="preserve">If any number looks wrong to you, please tell us (question Q2).</w:t>
+      </w:r>
+    </w:p>
+    <w:p>
+      <w:pPr>
+        <w:pStyle w:val="Heading2"/>
+      </w:pPr>
+      <w:r>
+        <w:t xml:space="preserve">Not built yet</w:t>
+      </w:r>
+    </w:p>
+    <w:p>
+      <w:pPr>
+        <w:pStyle w:val="ListParagraph"/>
+        <w:numPr>
+          <w:ilvl w:val="0"/>
+          <w:numId w:val="2"/>
+        </w:numPr>
+        <w:spacing w:after="60"/>
+      </w:pPr>
+      <w:r>
+        <w:t xml:space="preserve">Logins for brand owners that show only their own brand: waiting for Q12, Q15 and Q18.</w:t>
+      </w:r>
+    </w:p>
+    <w:p>
+      <w:pPr>
+        <w:pStyle w:val="ListParagraph"/>
+        <w:numPr>
+          <w:ilvl w:val="0"/>
+          <w:numId w:val="2"/>
+        </w:numPr>
+        <w:spacing w:after="60"/>
+      </w:pPr>
+      <w:r>
+        <w:t xml:space="preserve">Adding and editing dishes, prices and photos on our website: waiting for Q36 to Q39.</w:t>
+      </w:r>
+    </w:p>
+    <w:p>
+      <w:pPr>
+        <w:pStyle w:val="ListParagraph"/>
+        <w:numPr>
+          <w:ilvl w:val="0"/>
+          <w:numId w:val="2"/>
+        </w:numPr>
+        <w:spacing w:after="60"/>
+      </w:pPr>
+      <w:r>
+        <w:t xml:space="preserve">Production and sales tracking: waiting for your tracking sheet (Q42).</w:t>
+      </w:r>
+    </w:p>
+    <w:p>
+      <w:pPr>
+        <w:pStyle w:val="ListParagraph"/>
+        <w:numPr>
+          <w:ilvl w:val="0"/>
+          <w:numId w:val="2"/>
+        </w:numPr>
+        <w:spacing w:after="60"/>
+      </w:pPr>
+      <w:r>
+        <w:t xml:space="preserve">Live Swiggy and Zomato orders, and sending menu changes to Rista: waiting for DotPe access.</w:t>
+      </w:r>
+    </w:p>
     <w:p>
       <w:pPr>
         <w:pStyle w:val="Heading1"/>
@@ -10458,7 +11155,7 @@
                 <w:sz w:val="20"/>
                 <w:szCs w:val="20"/>
               </w:rPr>
-              <w:t xml:space="preserve">Each sale has a "Business Brand" and an "Account Name", and they do not always match (see section 3). The data suggests the Business Brand is the brand the customer ordered from, and the Account Name is the brand that owns the dish. Which one decides who owns a sale, and therefore which client can see it?</w:t>
+              <w:t xml:space="preserve">Each sale has a "Business Brand" and an "Account Name", and they do not always match (see section 3). The data suggests the Business Brand is the brand the customer ordered from, and the Account Name is the brand that owns the dish. Our Rista Sales page has a switch to show either one. Which one decides who owns a sale, and therefore which client can see it?</w:t>
             </w:r>
           </w:p>
           <w:p>
@@ -13926,7 +14623,7 @@
                 <w:sz w:val="20"/>
                 <w:szCs w:val="20"/>
               </w:rPr>
-              <w:t xml:space="preserve">The file you downloaded ("Sales Items By Transaction") has 82 columns and one line per dish. What should clients get?</w:t>
+              <w:t xml:space="preserve">The file you downloaded ("Sales Items By Transaction") has 82 columns and one line per dish. Our Rista Sales page already shows a summary and lets you download the lines. What should clients get?</w:t>
             </w:r>
           </w:p>
           <w:p>
@@ -33417,7 +34114,7 @@
         <w:spacing w:after="60"/>
       </w:pPr>
       <w:r>
-        <w:t xml:space="preserve">Sales reports limited to the person's own brand, with date range and branch selection, first from a monthly Rista download covering all branches, then automatically once the API is available. Cancelled orders shown separately.</w:t>
+        <w:t xml:space="preserve">Showing the Rista Sales page to brand owners, limited to their own brand, once the brand questions are answered (it works today for admin and management). Later it will update automatically once the API is available.</w:t>
       </w:r>
     </w:p>
     <w:p>
@@ -33444,19 +34141,6 @@
       </w:pPr>
       <w:r>
         <w:t xml:space="preserve">Production and sales tracking (R6), using sales typed into the website or loaded from Rista files until the API is available.</w:t>
-      </w:r>
-    </w:p>
-    <w:p>
-      <w:pPr>
-        <w:pStyle w:val="ListParagraph"/>
-        <w:numPr>
-          <w:ilvl w:val="0"/>
-          <w:numId w:val="2"/>
-        </w:numPr>
-        <w:spacing w:after="60"/>
-      </w:pPr>
-      <w:r>
-        <w:t xml:space="preserve">Item search on the Production and Sales screens.</w:t>
       </w:r>
     </w:p>
     <w:p>

</xml_diff>